<commit_message>
Doc1 expanded: Add comprehensive cross-border tax planning section (7.1–7.7) with US-Korea treaty, FIPA incentives timeline, Form 5471/FBAR/FATCA, profit repatriation strategy, and integrated compliance calendar
</commit_message>
<xml_diff>
--- a/files/Resonate_Club_US_Investor_Guide_EN.docx
+++ b/files/Resonate_Club_US_Investor_Guide_EN.docx
@@ -2991,6 +2991,91 @@
           </w:p>
         </w:tc>
       </w:tr>
+      <w:tr>
+        <w:tc>
+          <w:tcPr>
+            <w:tcW w:type="dxa" w:w="3324"/>
+            <w:shd w:fill="f0f4f8" w:val="clear"/>
+          </w:tcPr>
+          <w:p>
+            <w:r>
+              <w:rPr>
+                <w:sz w:val="18"/>
+              </w:rPr>
+              <w:t>US tax compliance penalties</w:t>
+            </w:r>
+          </w:p>
+        </w:tc>
+        <w:tc>
+          <w:tcPr>
+            <w:tcW w:type="dxa" w:w="3324"/>
+            <w:shd w:fill="f0f4f8" w:val="clear"/>
+          </w:tcPr>
+          <w:p>
+            <w:r>
+              <w:rPr>
+                <w:sz w:val="18"/>
+              </w:rPr>
+              <w:t>High</w:t>
+            </w:r>
+          </w:p>
+        </w:tc>
+        <w:tc>
+          <w:tcPr>
+            <w:tcW w:type="dxa" w:w="3324"/>
+            <w:shd w:fill="f0f4f8" w:val="clear"/>
+          </w:tcPr>
+          <w:p>
+            <w:r>
+              <w:rPr>
+                <w:sz w:val="18"/>
+              </w:rPr>
+              <w:t>Form 5471 non-filing = $10,000+ penalty per form per year — engage CPA before investing</w:t>
+            </w:r>
+          </w:p>
+        </w:tc>
+      </w:tr>
+      <w:tr>
+        <w:tc>
+          <w:tcPr>
+            <w:tcW w:type="dxa" w:w="3324"/>
+          </w:tcPr>
+          <w:p>
+            <w:r>
+              <w:rPr>
+                <w:sz w:val="18"/>
+              </w:rPr>
+              <w:t>PFIC classification risk</w:t>
+            </w:r>
+          </w:p>
+        </w:tc>
+        <w:tc>
+          <w:tcPr>
+            <w:tcW w:type="dxa" w:w="3324"/>
+          </w:tcPr>
+          <w:p>
+            <w:r>
+              <w:rPr>
+                <w:sz w:val="18"/>
+              </w:rPr>
+              <w:t>Low</w:t>
+            </w:r>
+          </w:p>
+        </w:tc>
+        <w:tc>
+          <w:tcPr>
+            <w:tcW w:type="dxa" w:w="3324"/>
+          </w:tcPr>
+          <w:p>
+            <w:r>
+              <w:rPr>
+                <w:sz w:val="18"/>
+              </w:rPr>
+              <w:t>Active travel business should NOT be PFIC, but confirm with CPA; Form 8621 filing is punitive</w:t>
+            </w:r>
+          </w:p>
+        </w:tc>
+      </w:tr>
     </w:tbl>
     <w:p/>
     <w:p>
@@ -3001,7 +3086,3086 @@
         <w:rPr>
           <w:color w:val="1A3450"/>
         </w:rPr>
-        <w:t>7. Key Contacts &amp; Resources</w:t>
+        <w:t>7. Cross-Border Tax Planning &amp; Compliance Timeline</w:t>
+      </w:r>
+    </w:p>
+    <w:p>
+      <w:r>
+        <w:t>This section outlines EVERY tax-related action the investor needs to take — in both the United States and Korea — organized chronologically from pre-investment through ongoing annual compliance. Engaging a qualified cross-border CPA (U.S. side) and a Korean 세무사 (tax accountant) is NOT optional — penalties for non-compliance are severe on both sides.</w:t>
+      </w:r>
+    </w:p>
+    <w:p>
+      <w:pPr>
+        <w:pStyle w:val="Heading2"/>
+      </w:pPr>
+      <w:r>
+        <w:rPr>
+          <w:color w:val="1A3450"/>
+        </w:rPr>
+        <w:t>7.1 Tax Professionals to Engage</w:t>
+      </w:r>
+    </w:p>
+    <w:tbl>
+      <w:tblPr>
+        <w:tblStyle w:val="TableGrid"/>
+        <w:tblW w:type="auto" w:w="0"/>
+        <w:jc w:val="center"/>
+        <w:tblLook w:firstColumn="1" w:firstRow="1" w:lastColumn="0" w:lastRow="0" w:noHBand="0" w:noVBand="1" w:val="04A0"/>
+      </w:tblPr>
+      <w:tblGrid>
+        <w:gridCol w:w="1994"/>
+        <w:gridCol w:w="1994"/>
+        <w:gridCol w:w="1994"/>
+        <w:gridCol w:w="1994"/>
+        <w:gridCol w:w="1994"/>
+      </w:tblGrid>
+      <w:tr>
+        <w:tc>
+          <w:tcPr>
+            <w:tcW w:type="dxa" w:w="1994"/>
+            <w:shd w:fill="1a3450" w:val="clear"/>
+          </w:tcPr>
+          <w:p>
+            <w:pPr>
+              <w:jc w:val="center"/>
+            </w:pPr>
+            <w:r>
+              <w:rPr>
+                <w:b/>
+                <w:color w:val="FFFFFF"/>
+                <w:sz w:val="18"/>
+              </w:rPr>
+              <w:t>Professional</w:t>
+            </w:r>
+          </w:p>
+        </w:tc>
+        <w:tc>
+          <w:tcPr>
+            <w:tcW w:type="dxa" w:w="1994"/>
+            <w:shd w:fill="1a3450" w:val="clear"/>
+          </w:tcPr>
+          <w:p>
+            <w:pPr>
+              <w:jc w:val="center"/>
+            </w:pPr>
+            <w:r>
+              <w:rPr>
+                <w:b/>
+                <w:color w:val="FFFFFF"/>
+                <w:sz w:val="18"/>
+              </w:rPr>
+              <w:t>Jurisdiction</w:t>
+            </w:r>
+          </w:p>
+        </w:tc>
+        <w:tc>
+          <w:tcPr>
+            <w:tcW w:type="dxa" w:w="1994"/>
+            <w:shd w:fill="1a3450" w:val="clear"/>
+          </w:tcPr>
+          <w:p>
+            <w:pPr>
+              <w:jc w:val="center"/>
+            </w:pPr>
+            <w:r>
+              <w:rPr>
+                <w:b/>
+                <w:color w:val="FFFFFF"/>
+                <w:sz w:val="18"/>
+              </w:rPr>
+              <w:t>When to Engage</w:t>
+            </w:r>
+          </w:p>
+        </w:tc>
+        <w:tc>
+          <w:tcPr>
+            <w:tcW w:type="dxa" w:w="1994"/>
+            <w:shd w:fill="1a3450" w:val="clear"/>
+          </w:tcPr>
+          <w:p>
+            <w:pPr>
+              <w:jc w:val="center"/>
+            </w:pPr>
+            <w:r>
+              <w:rPr>
+                <w:b/>
+                <w:color w:val="FFFFFF"/>
+                <w:sz w:val="18"/>
+              </w:rPr>
+              <w:t>Estimated Cost</w:t>
+            </w:r>
+          </w:p>
+        </w:tc>
+        <w:tc>
+          <w:tcPr>
+            <w:tcW w:type="dxa" w:w="1994"/>
+            <w:shd w:fill="1a3450" w:val="clear"/>
+          </w:tcPr>
+          <w:p>
+            <w:pPr>
+              <w:jc w:val="center"/>
+            </w:pPr>
+            <w:r>
+              <w:rPr>
+                <w:b/>
+                <w:color w:val="FFFFFF"/>
+                <w:sz w:val="18"/>
+              </w:rPr>
+              <w:t>Key Role</w:t>
+            </w:r>
+          </w:p>
+        </w:tc>
+      </w:tr>
+      <w:tr>
+        <w:tc>
+          <w:tcPr>
+            <w:tcW w:type="dxa" w:w="1994"/>
+            <w:shd w:fill="f0f4f8" w:val="clear"/>
+          </w:tcPr>
+          <w:p>
+            <w:r>
+              <w:rPr>
+                <w:sz w:val="18"/>
+              </w:rPr>
+              <w:t>U.S. Cross-Border CPA</w:t>
+              <w:br/>
+              <w:t>(EA or CPA with intl experience)</w:t>
+            </w:r>
+          </w:p>
+        </w:tc>
+        <w:tc>
+          <w:tcPr>
+            <w:tcW w:type="dxa" w:w="1994"/>
+            <w:shd w:fill="f0f4f8" w:val="clear"/>
+          </w:tcPr>
+          <w:p>
+            <w:r>
+              <w:rPr>
+                <w:sz w:val="18"/>
+              </w:rPr>
+              <w:t>USA (IRS)</w:t>
+            </w:r>
+          </w:p>
+        </w:tc>
+        <w:tc>
+          <w:tcPr>
+            <w:tcW w:type="dxa" w:w="1994"/>
+            <w:shd w:fill="f0f4f8" w:val="clear"/>
+          </w:tcPr>
+          <w:p>
+            <w:r>
+              <w:rPr>
+                <w:sz w:val="18"/>
+              </w:rPr>
+              <w:t>NOW — before any money moves</w:t>
+            </w:r>
+          </w:p>
+        </w:tc>
+        <w:tc>
+          <w:tcPr>
+            <w:tcW w:type="dxa" w:w="1994"/>
+            <w:shd w:fill="f0f4f8" w:val="clear"/>
+          </w:tcPr>
+          <w:p>
+            <w:r>
+              <w:rPr>
+                <w:sz w:val="18"/>
+              </w:rPr>
+              <w:t>$2,500–5,000 initial</w:t>
+              <w:br/>
+              <w:t>$1,500–3,000/year</w:t>
+            </w:r>
+          </w:p>
+        </w:tc>
+        <w:tc>
+          <w:tcPr>
+            <w:tcW w:type="dxa" w:w="1994"/>
+            <w:shd w:fill="f0f4f8" w:val="clear"/>
+          </w:tcPr>
+          <w:p>
+            <w:r>
+              <w:rPr>
+                <w:sz w:val="18"/>
+              </w:rPr>
+              <w:t>Form 5471, FBAR, FATCA, foreign tax credit (Form 1116), structure advice, PFIC analysis</w:t>
+            </w:r>
+          </w:p>
+        </w:tc>
+      </w:tr>
+      <w:tr>
+        <w:tc>
+          <w:tcPr>
+            <w:tcW w:type="dxa" w:w="1994"/>
+          </w:tcPr>
+          <w:p>
+            <w:r>
+              <w:rPr>
+                <w:sz w:val="18"/>
+              </w:rPr>
+              <w:t>Korean 세무사</w:t>
+              <w:br/>
+              <w:t>(Tax Accountant)</w:t>
+            </w:r>
+          </w:p>
+        </w:tc>
+        <w:tc>
+          <w:tcPr>
+            <w:tcW w:type="dxa" w:w="1994"/>
+          </w:tcPr>
+          <w:p>
+            <w:r>
+              <w:rPr>
+                <w:sz w:val="18"/>
+              </w:rPr>
+              <w:t>Korea (NTS)</w:t>
+            </w:r>
+          </w:p>
+        </w:tc>
+        <w:tc>
+          <w:tcPr>
+            <w:tcW w:type="dxa" w:w="1994"/>
+          </w:tcPr>
+          <w:p>
+            <w:r>
+              <w:rPr>
+                <w:sz w:val="18"/>
+              </w:rPr>
+              <w:t>Jul–Aug 2026 (before 사업자등록)</w:t>
+            </w:r>
+          </w:p>
+        </w:tc>
+        <w:tc>
+          <w:tcPr>
+            <w:tcW w:type="dxa" w:w="1994"/>
+          </w:tcPr>
+          <w:p>
+            <w:r>
+              <w:rPr>
+                <w:sz w:val="18"/>
+              </w:rPr>
+              <w:t>₩300,000–500,000/month</w:t>
+              <w:br/>
+              <w:t>(ongoing bookkeeping)</w:t>
+            </w:r>
+          </w:p>
+        </w:tc>
+        <w:tc>
+          <w:tcPr>
+            <w:tcW w:type="dxa" w:w="1994"/>
+          </w:tcPr>
+          <w:p>
+            <w:r>
+              <w:rPr>
+                <w:sz w:val="18"/>
+              </w:rPr>
+              <w:t>Corporate tax filing, VAT returns, payroll tax (if hiring), FIPA incentive applications, withholding tax on dividends</w:t>
+            </w:r>
+          </w:p>
+        </w:tc>
+      </w:tr>
+      <w:tr>
+        <w:tc>
+          <w:tcPr>
+            <w:tcW w:type="dxa" w:w="1994"/>
+            <w:shd w:fill="f0f4f8" w:val="clear"/>
+          </w:tcPr>
+          <w:p>
+            <w:r>
+              <w:rPr>
+                <w:sz w:val="18"/>
+              </w:rPr>
+              <w:t>U.S. Estate Planning Attorney</w:t>
+              <w:br/>
+              <w:t>(if significant net worth)</w:t>
+            </w:r>
+          </w:p>
+        </w:tc>
+        <w:tc>
+          <w:tcPr>
+            <w:tcW w:type="dxa" w:w="1994"/>
+            <w:shd w:fill="f0f4f8" w:val="clear"/>
+          </w:tcPr>
+          <w:p>
+            <w:r>
+              <w:rPr>
+                <w:sz w:val="18"/>
+              </w:rPr>
+              <w:t>USA</w:t>
+            </w:r>
+          </w:p>
+        </w:tc>
+        <w:tc>
+          <w:tcPr>
+            <w:tcW w:type="dxa" w:w="1994"/>
+            <w:shd w:fill="f0f4f8" w:val="clear"/>
+          </w:tcPr>
+          <w:p>
+            <w:r>
+              <w:rPr>
+                <w:sz w:val="18"/>
+              </w:rPr>
+              <w:t>Before investing</w:t>
+            </w:r>
+          </w:p>
+        </w:tc>
+        <w:tc>
+          <w:tcPr>
+            <w:tcW w:type="dxa" w:w="1994"/>
+            <w:shd w:fill="f0f4f8" w:val="clear"/>
+          </w:tcPr>
+          <w:p>
+            <w:r>
+              <w:rPr>
+                <w:sz w:val="18"/>
+              </w:rPr>
+              <w:t>$3,000–7,000 one-time</w:t>
+            </w:r>
+          </w:p>
+        </w:tc>
+        <w:tc>
+          <w:tcPr>
+            <w:tcW w:type="dxa" w:w="1994"/>
+            <w:shd w:fill="f0f4f8" w:val="clear"/>
+          </w:tcPr>
+          <w:p>
+            <w:r>
+              <w:rPr>
+                <w:sz w:val="18"/>
+              </w:rPr>
+              <w:t>Korean situs assets in U.S. estate, gift tax implications of share transfers, QDOT planning if non-citizen spouse</w:t>
+            </w:r>
+          </w:p>
+        </w:tc>
+      </w:tr>
+      <w:tr>
+        <w:tc>
+          <w:tcPr>
+            <w:tcW w:type="dxa" w:w="1994"/>
+          </w:tcPr>
+          <w:p>
+            <w:r>
+              <w:rPr>
+                <w:sz w:val="18"/>
+              </w:rPr>
+              <w:t>Korean 법무사</w:t>
+              <w:br/>
+              <w:t>(Legal Administrator)</w:t>
+            </w:r>
+          </w:p>
+        </w:tc>
+        <w:tc>
+          <w:tcPr>
+            <w:tcW w:type="dxa" w:w="1994"/>
+          </w:tcPr>
+          <w:p>
+            <w:r>
+              <w:rPr>
+                <w:sz w:val="18"/>
+              </w:rPr>
+              <w:t>Korea</w:t>
+            </w:r>
+          </w:p>
+        </w:tc>
+        <w:tc>
+          <w:tcPr>
+            <w:tcW w:type="dxa" w:w="1994"/>
+          </w:tcPr>
+          <w:p>
+            <w:r>
+              <w:rPr>
+                <w:sz w:val="18"/>
+              </w:rPr>
+              <w:t>Jul 2026</w:t>
+            </w:r>
+          </w:p>
+        </w:tc>
+        <w:tc>
+          <w:tcPr>
+            <w:tcW w:type="dxa" w:w="1994"/>
+          </w:tcPr>
+          <w:p>
+            <w:r>
+              <w:rPr>
+                <w:sz w:val="18"/>
+              </w:rPr>
+              <w:t>₩500,000–800,000</w:t>
+            </w:r>
+          </w:p>
+        </w:tc>
+        <w:tc>
+          <w:tcPr>
+            <w:tcW w:type="dxa" w:w="1994"/>
+          </w:tcPr>
+          <w:p>
+            <w:r>
+              <w:rPr>
+                <w:sz w:val="18"/>
+              </w:rPr>
+              <w:t>Corporation registration, FDI filing, shareholder registry maintenance</w:t>
+            </w:r>
+          </w:p>
+        </w:tc>
+      </w:tr>
+    </w:tbl>
+    <w:p/>
+    <w:p>
+      <w:pPr>
+        <w:pStyle w:val="Heading2"/>
+      </w:pPr>
+      <w:r>
+        <w:rPr>
+          <w:color w:val="1A3450"/>
+        </w:rPr>
+        <w:t>7.2 Pre-Investment Tax Structuring — NOW Through July 15, 2026</w:t>
+      </w:r>
+    </w:p>
+    <w:p>
+      <w:r>
+        <w:t>⚠️ CRITICAL: The decisions made BEFORE money moves are the most consequential for long-term tax outcomes.</w:t>
+        <w:br/>
+        <w:br/>
+        <w:t>Action 1 — Ownership Structure Decision (NOW):</w:t>
+        <w:br/>
+        <w:t>• Option A: Direct individual ownership (investor name directly on Korean shareholder registry)</w:t>
+        <w:br/>
+        <w:t xml:space="preserve">  → Simpler setup; Form 5471 Category 3 filer; dividends taxed at qualified dividend rates if eligible</w:t>
+        <w:br/>
+        <w:t>• Option B: U.S. LLC/S-Corp as holding entity</w:t>
+        <w:br/>
+        <w:t xml:space="preserve">  → Added complexity &amp; cost; potential state tax benefits; Form 5471 Category 4 or 5 filer</w:t>
+        <w:br/>
+        <w:t xml:space="preserve">  → S-Corp CANNOT have foreign shareholders; if investor has non-US family, use LLC or C-Corp</w:t>
+        <w:br/>
+        <w:t>• Recommendation: Start with direct ownership (Option A) unless estate planning or anonymity concerns dictate otherwise.</w:t>
+        <w:br/>
+        <w:br/>
+        <w:t>Action 2 — PFIC Analysis (NOW):</w:t>
+        <w:br/>
+        <w:t>• A Passive Foreign Investment Company (PFIC) triggers Form 8621 — one of the most punitive IRS regimes</w:t>
+        <w:br/>
+        <w:t>• Test: &gt;50% passive income OR &gt;50% passive assets = PFIC</w:t>
+        <w:br/>
+        <w:t>• Resonate Club is an ACTIVE travel business — should NOT be PFIC</w:t>
+        <w:br/>
+        <w:t>• GET CPA OPINION LETTER confirming non-PFIC status — do NOT skip this</w:t>
+        <w:br/>
+        <w:br/>
+        <w:t>Action 3 — Investment Tracking System Setup (NOW):</w:t>
+        <w:br/>
+        <w:t>• Set up spreadsheet/software to track: investment date, KRW amount, USD exchange rate at each transfer</w:t>
+        <w:br/>
+        <w:t>• Needed for: foreign tax credit calculation, future exit capital gains basis, Section 986(c) exchange rate elections</w:t>
+        <w:br/>
+        <w:br/>
+        <w:t>Action 4 — FBAR/Form 8938 Readiness (NOW):</w:t>
+        <w:br/>
+        <w:t>• FBAR (FinCEN Form 114): Required if aggregate foreign accounts &gt;$10,000 at any point in calendar year</w:t>
+        <w:br/>
+        <w:t>• Form 8938 (FATCA): Required if foreign financial assets &gt;$200,000 (single) / $400,000 (married) on Dec 31</w:t>
+        <w:br/>
+        <w:t>• Both are INFORMATION returns (not tax due) — but penalties are $10,000+ per violation</w:t>
+        <w:br/>
+        <w:t>• Plan for the Korean corporate account(s) + any personal Korean accounts to trigger these thresholds</w:t>
+        <w:br/>
+        <w:br/>
+        <w:t>Action 5 — Capitalization Strategy (consult CPA):</w:t>
+        <w:br/>
+        <w:t>• Equity vs. shareholder loan mix: loans can be repaid tax-free (vs. dividends subject to withholding)</w:t>
+        <w:br/>
+        <w:t>• Thin capitalization rules in Korea: interest deductions may be limited if debt-to-equity ratio &gt; 2:1</w:t>
+        <w:br/>
+        <w:t>• Recommendation: At least 70% equity, 30% shareholder loan if debt structure desired</w:t>
+      </w:r>
+    </w:p>
+    <w:p>
+      <w:pPr>
+        <w:pStyle w:val="Heading2"/>
+      </w:pPr>
+      <w:r>
+        <w:rPr>
+          <w:color w:val="1A3450"/>
+        </w:rPr>
+        <w:t>7.3 Korean FIPA Tax Incentives — Timeline &amp; Application Process</w:t>
+      </w:r>
+    </w:p>
+    <w:p>
+      <w:r>
+        <w:t>Under the Foreign Investment Promotion Act (FIPA / 외국인투자촉진법), foreign-invested enterprises qualify for the following tax benefits. Each requires proactive APPLICATION — they are not automatic.</w:t>
+      </w:r>
+    </w:p>
+    <w:tbl>
+      <w:tblPr>
+        <w:tblStyle w:val="TableGrid"/>
+        <w:tblW w:type="auto" w:w="0"/>
+        <w:jc w:val="center"/>
+        <w:tblLook w:firstColumn="1" w:firstRow="1" w:lastColumn="0" w:lastRow="0" w:noHBand="0" w:noVBand="1" w:val="04A0"/>
+      </w:tblPr>
+      <w:tblGrid>
+        <w:gridCol w:w="1994"/>
+        <w:gridCol w:w="1994"/>
+        <w:gridCol w:w="1994"/>
+        <w:gridCol w:w="1994"/>
+        <w:gridCol w:w="1994"/>
+      </w:tblGrid>
+      <w:tr>
+        <w:tc>
+          <w:tcPr>
+            <w:tcW w:type="dxa" w:w="1994"/>
+            <w:shd w:fill="1a3450" w:val="clear"/>
+          </w:tcPr>
+          <w:p>
+            <w:pPr>
+              <w:jc w:val="center"/>
+            </w:pPr>
+            <w:r>
+              <w:rPr>
+                <w:b/>
+                <w:color w:val="FFFFFF"/>
+                <w:sz w:val="18"/>
+              </w:rPr>
+              <w:t>Incentive</w:t>
+            </w:r>
+          </w:p>
+        </w:tc>
+        <w:tc>
+          <w:tcPr>
+            <w:tcW w:type="dxa" w:w="1994"/>
+            <w:shd w:fill="1a3450" w:val="clear"/>
+          </w:tcPr>
+          <w:p>
+            <w:pPr>
+              <w:jc w:val="center"/>
+            </w:pPr>
+            <w:r>
+              <w:rPr>
+                <w:b/>
+                <w:color w:val="FFFFFF"/>
+                <w:sz w:val="18"/>
+              </w:rPr>
+              <w:t>Benefit</w:t>
+            </w:r>
+          </w:p>
+        </w:tc>
+        <w:tc>
+          <w:tcPr>
+            <w:tcW w:type="dxa" w:w="1994"/>
+            <w:shd w:fill="1a3450" w:val="clear"/>
+          </w:tcPr>
+          <w:p>
+            <w:pPr>
+              <w:jc w:val="center"/>
+            </w:pPr>
+            <w:r>
+              <w:rPr>
+                <w:b/>
+                <w:color w:val="FFFFFF"/>
+                <w:sz w:val="18"/>
+              </w:rPr>
+              <w:t>Duration</w:t>
+            </w:r>
+          </w:p>
+        </w:tc>
+        <w:tc>
+          <w:tcPr>
+            <w:tcW w:type="dxa" w:w="1994"/>
+            <w:shd w:fill="1a3450" w:val="clear"/>
+          </w:tcPr>
+          <w:p>
+            <w:pPr>
+              <w:jc w:val="center"/>
+            </w:pPr>
+            <w:r>
+              <w:rPr>
+                <w:b/>
+                <w:color w:val="FFFFFF"/>
+                <w:sz w:val="18"/>
+              </w:rPr>
+              <w:t>When to Apply</w:t>
+            </w:r>
+          </w:p>
+        </w:tc>
+        <w:tc>
+          <w:tcPr>
+            <w:tcW w:type="dxa" w:w="1994"/>
+            <w:shd w:fill="1a3450" w:val="clear"/>
+          </w:tcPr>
+          <w:p>
+            <w:pPr>
+              <w:jc w:val="center"/>
+            </w:pPr>
+            <w:r>
+              <w:rPr>
+                <w:b/>
+                <w:color w:val="FFFFFF"/>
+                <w:sz w:val="18"/>
+              </w:rPr>
+              <w:t>Who Handles It</w:t>
+            </w:r>
+          </w:p>
+        </w:tc>
+      </w:tr>
+      <w:tr>
+        <w:tc>
+          <w:tcPr>
+            <w:tcW w:type="dxa" w:w="1994"/>
+            <w:shd w:fill="f0f4f8" w:val="clear"/>
+          </w:tcPr>
+          <w:p>
+            <w:r>
+              <w:rPr>
+                <w:sz w:val="18"/>
+              </w:rPr>
+              <w:t>Corporate Income Tax</w:t>
+              <w:br/>
+              <w:t>Reduction (법인세 감면)</w:t>
+            </w:r>
+          </w:p>
+        </w:tc>
+        <w:tc>
+          <w:tcPr>
+            <w:tcW w:type="dxa" w:w="1994"/>
+            <w:shd w:fill="f0f4f8" w:val="clear"/>
+          </w:tcPr>
+          <w:p>
+            <w:r>
+              <w:rPr>
+                <w:sz w:val="18"/>
+              </w:rPr>
+              <w:t>100% exemption years 1-5</w:t>
+              <w:br/>
+              <w:t>50% reduction years 6-7</w:t>
+              <w:br/>
+              <w:t>(Applies only to income from the qualified business)</w:t>
+            </w:r>
+          </w:p>
+        </w:tc>
+        <w:tc>
+          <w:tcPr>
+            <w:tcW w:type="dxa" w:w="1994"/>
+            <w:shd w:fill="f0f4f8" w:val="clear"/>
+          </w:tcPr>
+          <w:p>
+            <w:r>
+              <w:rPr>
+                <w:sz w:val="18"/>
+              </w:rPr>
+              <w:t>7 years</w:t>
+            </w:r>
+          </w:p>
+        </w:tc>
+        <w:tc>
+          <w:tcPr>
+            <w:tcW w:type="dxa" w:w="1994"/>
+            <w:shd w:fill="f0f4f8" w:val="clear"/>
+          </w:tcPr>
+          <w:p>
+            <w:r>
+              <w:rPr>
+                <w:sz w:val="18"/>
+              </w:rPr>
+              <w:t>Within FY of first profit</w:t>
+              <w:br/>
+              <w:t>(or by tax filing deadline)</w:t>
+            </w:r>
+          </w:p>
+        </w:tc>
+        <w:tc>
+          <w:tcPr>
+            <w:tcW w:type="dxa" w:w="1994"/>
+            <w:shd w:fill="f0f4f8" w:val="clear"/>
+          </w:tcPr>
+          <w:p>
+            <w:r>
+              <w:rPr>
+                <w:sz w:val="18"/>
+              </w:rPr>
+              <w:t>Korean 세무사 — files with NTS</w:t>
+              <w:br/>
+              <w:t>(FIPA Article 121-2, RETI Article 116-2)</w:t>
+            </w:r>
+          </w:p>
+        </w:tc>
+      </w:tr>
+      <w:tr>
+        <w:tc>
+          <w:tcPr>
+            <w:tcW w:type="dxa" w:w="1994"/>
+          </w:tcPr>
+          <w:p>
+            <w:r>
+              <w:rPr>
+                <w:sz w:val="18"/>
+              </w:rPr>
+              <w:t>Acquisition Tax</w:t>
+              <w:br/>
+              <w:t>Exemption (취득세 면제)</w:t>
+            </w:r>
+          </w:p>
+        </w:tc>
+        <w:tc>
+          <w:tcPr>
+            <w:tcW w:type="dxa" w:w="1994"/>
+          </w:tcPr>
+          <w:p>
+            <w:r>
+              <w:rPr>
+                <w:sz w:val="18"/>
+              </w:rPr>
+              <w:t>100% exemption on real estate,</w:t>
+              <w:br/>
+              <w:t>vehicles, equipment acquired</w:t>
+              <w:br/>
+              <w:t>for the business</w:t>
+            </w:r>
+          </w:p>
+        </w:tc>
+        <w:tc>
+          <w:tcPr>
+            <w:tcW w:type="dxa" w:w="1994"/>
+          </w:tcPr>
+          <w:p>
+            <w:r>
+              <w:rPr>
+                <w:sz w:val="18"/>
+              </w:rPr>
+              <w:t>15 years from</w:t>
+              <w:br/>
+              <w:t>business registration</w:t>
+            </w:r>
+          </w:p>
+        </w:tc>
+        <w:tc>
+          <w:tcPr>
+            <w:tcW w:type="dxa" w:w="1994"/>
+          </w:tcPr>
+          <w:p>
+            <w:r>
+              <w:rPr>
+                <w:sz w:val="18"/>
+              </w:rPr>
+              <w:t>At time of each</w:t>
+              <w:br/>
+              <w:t>qualifying purchase</w:t>
+            </w:r>
+          </w:p>
+        </w:tc>
+        <w:tc>
+          <w:tcPr>
+            <w:tcW w:type="dxa" w:w="1994"/>
+          </w:tcPr>
+          <w:p>
+            <w:r>
+              <w:rPr>
+                <w:sz w:val="18"/>
+              </w:rPr>
+              <w:t>Korean 세무사 — files with local</w:t>
+              <w:br/>
+              <w:t>government (지방자치단체)</w:t>
+              <w:br/>
+              <w:t>(FIPA Article 121-3)</w:t>
+            </w:r>
+          </w:p>
+        </w:tc>
+      </w:tr>
+      <w:tr>
+        <w:tc>
+          <w:tcPr>
+            <w:tcW w:type="dxa" w:w="1994"/>
+            <w:shd w:fill="f0f4f8" w:val="clear"/>
+          </w:tcPr>
+          <w:p>
+            <w:r>
+              <w:rPr>
+                <w:sz w:val="18"/>
+              </w:rPr>
+              <w:t>Property Tax</w:t>
+              <w:br/>
+              <w:t>Reduction (재산세 감면)</w:t>
+            </w:r>
+          </w:p>
+        </w:tc>
+        <w:tc>
+          <w:tcPr>
+            <w:tcW w:type="dxa" w:w="1994"/>
+            <w:shd w:fill="f0f4f8" w:val="clear"/>
+          </w:tcPr>
+          <w:p>
+            <w:r>
+              <w:rPr>
+                <w:sz w:val="18"/>
+              </w:rPr>
+              <w:t>100% years 1-5</w:t>
+              <w:br/>
+              <w:t>50% years 6-15</w:t>
+              <w:br/>
+              <w:t>(on business property)</w:t>
+            </w:r>
+          </w:p>
+        </w:tc>
+        <w:tc>
+          <w:tcPr>
+            <w:tcW w:type="dxa" w:w="1994"/>
+            <w:shd w:fill="f0f4f8" w:val="clear"/>
+          </w:tcPr>
+          <w:p>
+            <w:r>
+              <w:rPr>
+                <w:sz w:val="18"/>
+              </w:rPr>
+              <w:t>15 years</w:t>
+            </w:r>
+          </w:p>
+        </w:tc>
+        <w:tc>
+          <w:tcPr>
+            <w:tcW w:type="dxa" w:w="1994"/>
+            <w:shd w:fill="f0f4f8" w:val="clear"/>
+          </w:tcPr>
+          <w:p>
+            <w:r>
+              <w:rPr>
+                <w:sz w:val="18"/>
+              </w:rPr>
+              <w:t>Annual — with property</w:t>
+              <w:br/>
+              <w:t>tax filing (July)</w:t>
+            </w:r>
+          </w:p>
+        </w:tc>
+        <w:tc>
+          <w:tcPr>
+            <w:tcW w:type="dxa" w:w="1994"/>
+            <w:shd w:fill="f0f4f8" w:val="clear"/>
+          </w:tcPr>
+          <w:p>
+            <w:r>
+              <w:rPr>
+                <w:sz w:val="18"/>
+              </w:rPr>
+              <w:t>Korean 세무사</w:t>
+            </w:r>
+          </w:p>
+        </w:tc>
+      </w:tr>
+      <w:tr>
+        <w:tc>
+          <w:tcPr>
+            <w:tcW w:type="dxa" w:w="1994"/>
+          </w:tcPr>
+          <w:p>
+            <w:r>
+              <w:rPr>
+                <w:sz w:val="18"/>
+              </w:rPr>
+              <w:t>Customs Duty Exemption</w:t>
+              <w:br/>
+              <w:t>(관세 면제)</w:t>
+            </w:r>
+          </w:p>
+        </w:tc>
+        <w:tc>
+          <w:tcPr>
+            <w:tcW w:type="dxa" w:w="1994"/>
+          </w:tcPr>
+          <w:p>
+            <w:r>
+              <w:rPr>
+                <w:sz w:val="18"/>
+              </w:rPr>
+              <w:t>100% exemption on capital</w:t>
+              <w:br/>
+              <w:t>goods imported for the business</w:t>
+              <w:br/>
+              <w:t>(e.g., tour vehicles, camera</w:t>
+              <w:br/>
+              <w:t>equipment, golf simulators)</w:t>
+            </w:r>
+          </w:p>
+        </w:tc>
+        <w:tc>
+          <w:tcPr>
+            <w:tcW w:type="dxa" w:w="1994"/>
+          </w:tcPr>
+          <w:p>
+            <w:r>
+              <w:rPr>
+                <w:sz w:val="18"/>
+              </w:rPr>
+              <w:t>Within 3 years of</w:t>
+              <w:br/>
+              <w:t>FDI registration</w:t>
+            </w:r>
+          </w:p>
+        </w:tc>
+        <w:tc>
+          <w:tcPr>
+            <w:tcW w:type="dxa" w:w="1994"/>
+          </w:tcPr>
+          <w:p>
+            <w:r>
+              <w:rPr>
+                <w:sz w:val="18"/>
+              </w:rPr>
+              <w:t>At each import — file</w:t>
+              <w:br/>
+              <w:t>with Korea Customs</w:t>
+              <w:br/>
+              <w:t>Service (관세청)</w:t>
+            </w:r>
+          </w:p>
+        </w:tc>
+        <w:tc>
+          <w:tcPr>
+            <w:tcW w:type="dxa" w:w="1994"/>
+          </w:tcPr>
+          <w:p>
+            <w:r>
+              <w:rPr>
+                <w:sz w:val="18"/>
+              </w:rPr>
+              <w:t>Korean 세무사/관세사</w:t>
+              <w:br/>
+              <w:t>Pre-approval: HS Code</w:t>
+              <w:br/>
+              <w:t>사전심사 recommended</w:t>
+            </w:r>
+          </w:p>
+        </w:tc>
+      </w:tr>
+      <w:tr>
+        <w:tc>
+          <w:tcPr>
+            <w:tcW w:type="dxa" w:w="1994"/>
+            <w:shd w:fill="f0f4f8" w:val="clear"/>
+          </w:tcPr>
+          <w:p>
+            <w:r>
+              <w:rPr>
+                <w:sz w:val="18"/>
+              </w:rPr>
+              <w:t>Dividend Withholding</w:t>
+              <w:br/>
+              <w:t>Tax Reduction</w:t>
+            </w:r>
+          </w:p>
+        </w:tc>
+        <w:tc>
+          <w:tcPr>
+            <w:tcW w:type="dxa" w:w="1994"/>
+            <w:shd w:fill="f0f4f8" w:val="clear"/>
+          </w:tcPr>
+          <w:p>
+            <w:r>
+              <w:rPr>
+                <w:sz w:val="18"/>
+              </w:rPr>
+              <w:t>Under US-Korea Tax Treaty:</w:t>
+              <w:br/>
+              <w:t>15% standard → 10% if 10%+</w:t>
+              <w:br/>
+              <w:t>ownership → possibly 5%</w:t>
+            </w:r>
+          </w:p>
+        </w:tc>
+        <w:tc>
+          <w:tcPr>
+            <w:tcW w:type="dxa" w:w="1994"/>
+            <w:shd w:fill="f0f4f8" w:val="clear"/>
+          </w:tcPr>
+          <w:p>
+            <w:r>
+              <w:rPr>
+                <w:sz w:val="18"/>
+              </w:rPr>
+              <w:t>Ongoing</w:t>
+            </w:r>
+          </w:p>
+        </w:tc>
+        <w:tc>
+          <w:tcPr>
+            <w:tcW w:type="dxa" w:w="1994"/>
+            <w:shd w:fill="f0f4f8" w:val="clear"/>
+          </w:tcPr>
+          <w:p>
+            <w:r>
+              <w:rPr>
+                <w:sz w:val="18"/>
+              </w:rPr>
+              <w:t>When declaring dividends</w:t>
+            </w:r>
+          </w:p>
+        </w:tc>
+        <w:tc>
+          <w:tcPr>
+            <w:tcW w:type="dxa" w:w="1994"/>
+            <w:shd w:fill="f0f4f8" w:val="clear"/>
+          </w:tcPr>
+          <w:p>
+            <w:r>
+              <w:rPr>
+                <w:sz w:val="18"/>
+              </w:rPr>
+              <w:t>Korean 세무사 — reduced</w:t>
+              <w:br/>
+              <w:t>rate application + U.S. Form</w:t>
+              <w:br/>
+              <w:t>8833 (treaty-based return</w:t>
+              <w:br/>
+              <w:t>position disclosure)</w:t>
+            </w:r>
+          </w:p>
+        </w:tc>
+      </w:tr>
+    </w:tbl>
+    <w:p/>
+    <w:p>
+      <w:r>
+        <w:t>⚠️ CRITICAL for FIPA Benefits:</w:t>
+        <w:br/>
+        <w:t>• Must file 외국인투자기업 등록신청 (FDI Enterprise Registration) BEFORE any tax benefit application</w:t>
+        <w:br/>
+        <w:t>• Tax reduction application (조세감면신청서) must be filed within the first taxable year after earning profit</w:t>
+        <w:br/>
+        <w:t>• MISSING the application deadline = permanent loss of the benefit for that year (no retroactive remedy)</w:t>
+        <w:br/>
+        <w:t>• The 세무사 must reference FIPA Article 121-2 through 121-5 and Restriction of Special Taxation Act (조세특례제한법)</w:t>
+        <w:br/>
+        <w:t>• Local tax exemptions require separate application to Busan Metropolitan City / Haeundae-gu office</w:t>
+      </w:r>
+    </w:p>
+    <w:p>
+      <w:pPr>
+        <w:pStyle w:val="Heading2"/>
+      </w:pPr>
+      <w:r>
+        <w:rPr>
+          <w:color w:val="1A3450"/>
+        </w:rPr>
+        <w:t>7.4 US-Korea Tax Treaty — Key Provisions</w:t>
+      </w:r>
+    </w:p>
+    <w:tbl>
+      <w:tblPr>
+        <w:tblStyle w:val="TableGrid"/>
+        <w:tblW w:type="auto" w:w="0"/>
+        <w:jc w:val="center"/>
+        <w:tblLook w:firstColumn="1" w:firstRow="1" w:lastColumn="0" w:lastRow="0" w:noHBand="0" w:noVBand="1" w:val="04A0"/>
+      </w:tblPr>
+      <w:tblGrid>
+        <w:gridCol w:w="2493"/>
+        <w:gridCol w:w="2493"/>
+        <w:gridCol w:w="2493"/>
+        <w:gridCol w:w="2493"/>
+      </w:tblGrid>
+      <w:tr>
+        <w:tc>
+          <w:tcPr>
+            <w:tcW w:type="dxa" w:w="2493"/>
+            <w:shd w:fill="1a3450" w:val="clear"/>
+          </w:tcPr>
+          <w:p>
+            <w:pPr>
+              <w:jc w:val="center"/>
+            </w:pPr>
+            <w:r>
+              <w:rPr>
+                <w:b/>
+                <w:color w:val="FFFFFF"/>
+                <w:sz w:val="18"/>
+              </w:rPr>
+              <w:t>Income Type</w:t>
+            </w:r>
+          </w:p>
+        </w:tc>
+        <w:tc>
+          <w:tcPr>
+            <w:tcW w:type="dxa" w:w="2493"/>
+            <w:shd w:fill="1a3450" w:val="clear"/>
+          </w:tcPr>
+          <w:p>
+            <w:pPr>
+              <w:jc w:val="center"/>
+            </w:pPr>
+            <w:r>
+              <w:rPr>
+                <w:b/>
+                <w:color w:val="FFFFFF"/>
+                <w:sz w:val="18"/>
+              </w:rPr>
+              <w:t>Without Treaty</w:t>
+            </w:r>
+          </w:p>
+        </w:tc>
+        <w:tc>
+          <w:tcPr>
+            <w:tcW w:type="dxa" w:w="2493"/>
+            <w:shd w:fill="1a3450" w:val="clear"/>
+          </w:tcPr>
+          <w:p>
+            <w:pPr>
+              <w:jc w:val="center"/>
+            </w:pPr>
+            <w:r>
+              <w:rPr>
+                <w:b/>
+                <w:color w:val="FFFFFF"/>
+                <w:sz w:val="18"/>
+              </w:rPr>
+              <w:t>With Treaty</w:t>
+            </w:r>
+          </w:p>
+        </w:tc>
+        <w:tc>
+          <w:tcPr>
+            <w:tcW w:type="dxa" w:w="2493"/>
+            <w:shd w:fill="1a3450" w:val="clear"/>
+          </w:tcPr>
+          <w:p>
+            <w:pPr>
+              <w:jc w:val="center"/>
+            </w:pPr>
+            <w:r>
+              <w:rPr>
+                <w:b/>
+                <w:color w:val="FFFFFF"/>
+                <w:sz w:val="18"/>
+              </w:rPr>
+              <w:t>IRS Form</w:t>
+            </w:r>
+          </w:p>
+        </w:tc>
+      </w:tr>
+      <w:tr>
+        <w:tc>
+          <w:tcPr>
+            <w:tcW w:type="dxa" w:w="2493"/>
+            <w:shd w:fill="f0f4f8" w:val="clear"/>
+          </w:tcPr>
+          <w:p>
+            <w:r>
+              <w:rPr>
+                <w:sz w:val="18"/>
+              </w:rPr>
+              <w:t>Dividends (배당소득)</w:t>
+            </w:r>
+          </w:p>
+        </w:tc>
+        <w:tc>
+          <w:tcPr>
+            <w:tcW w:type="dxa" w:w="2493"/>
+            <w:shd w:fill="f0f4f8" w:val="clear"/>
+          </w:tcPr>
+          <w:p>
+            <w:r>
+              <w:rPr>
+                <w:sz w:val="18"/>
+              </w:rPr>
+              <w:t>30% withholding</w:t>
+            </w:r>
+          </w:p>
+        </w:tc>
+        <w:tc>
+          <w:tcPr>
+            <w:tcW w:type="dxa" w:w="2493"/>
+            <w:shd w:fill="f0f4f8" w:val="clear"/>
+          </w:tcPr>
+          <w:p>
+            <w:r>
+              <w:rPr>
+                <w:sz w:val="18"/>
+              </w:rPr>
+              <w:t>15% (standard)</w:t>
+              <w:br/>
+              <w:t>10% if ≥10% ownership</w:t>
+              <w:br/>
+              <w:t>5% if ≥10% ownership</w:t>
+              <w:br/>
+              <w:t>+ certain conditions</w:t>
+            </w:r>
+          </w:p>
+        </w:tc>
+        <w:tc>
+          <w:tcPr>
+            <w:tcW w:type="dxa" w:w="2493"/>
+            <w:shd w:fill="f0f4f8" w:val="clear"/>
+          </w:tcPr>
+          <w:p>
+            <w:r>
+              <w:rPr>
+                <w:sz w:val="18"/>
+              </w:rPr>
+              <w:t>IRS Form 1116</w:t>
+              <w:br/>
+              <w:t>(Foreign Tax Credit)</w:t>
+              <w:br/>
+              <w:t>Form 8833 (Treaty Disclosure)</w:t>
+            </w:r>
+          </w:p>
+        </w:tc>
+      </w:tr>
+      <w:tr>
+        <w:tc>
+          <w:tcPr>
+            <w:tcW w:type="dxa" w:w="2493"/>
+          </w:tcPr>
+          <w:p>
+            <w:r>
+              <w:rPr>
+                <w:sz w:val="18"/>
+              </w:rPr>
+              <w:t>Interest (이자소득)</w:t>
+            </w:r>
+          </w:p>
+        </w:tc>
+        <w:tc>
+          <w:tcPr>
+            <w:tcW w:type="dxa" w:w="2493"/>
+          </w:tcPr>
+          <w:p>
+            <w:r>
+              <w:rPr>
+                <w:sz w:val="18"/>
+              </w:rPr>
+              <w:t>30% withholding</w:t>
+            </w:r>
+          </w:p>
+        </w:tc>
+        <w:tc>
+          <w:tcPr>
+            <w:tcW w:type="dxa" w:w="2493"/>
+          </w:tcPr>
+          <w:p>
+            <w:r>
+              <w:rPr>
+                <w:sz w:val="18"/>
+              </w:rPr>
+              <w:t>12% (standard)</w:t>
+              <w:br/>
+              <w:t>May be reduced/exempt</w:t>
+              <w:br/>
+              <w:t>for certain loans</w:t>
+            </w:r>
+          </w:p>
+        </w:tc>
+        <w:tc>
+          <w:tcPr>
+            <w:tcW w:type="dxa" w:w="2493"/>
+          </w:tcPr>
+          <w:p>
+            <w:r>
+              <w:rPr>
+                <w:sz w:val="18"/>
+              </w:rPr>
+              <w:t>Form 1116</w:t>
+            </w:r>
+          </w:p>
+        </w:tc>
+      </w:tr>
+      <w:tr>
+        <w:tc>
+          <w:tcPr>
+            <w:tcW w:type="dxa" w:w="2493"/>
+            <w:shd w:fill="f0f4f8" w:val="clear"/>
+          </w:tcPr>
+          <w:p>
+            <w:r>
+              <w:rPr>
+                <w:sz w:val="18"/>
+              </w:rPr>
+              <w:t>Royalties (사용료)</w:t>
+            </w:r>
+          </w:p>
+        </w:tc>
+        <w:tc>
+          <w:tcPr>
+            <w:tcW w:type="dxa" w:w="2493"/>
+            <w:shd w:fill="f0f4f8" w:val="clear"/>
+          </w:tcPr>
+          <w:p>
+            <w:r>
+              <w:rPr>
+                <w:sz w:val="18"/>
+              </w:rPr>
+              <w:t>30% withholding</w:t>
+            </w:r>
+          </w:p>
+        </w:tc>
+        <w:tc>
+          <w:tcPr>
+            <w:tcW w:type="dxa" w:w="2493"/>
+            <w:shd w:fill="f0f4f8" w:val="clear"/>
+          </w:tcPr>
+          <w:p>
+            <w:r>
+              <w:rPr>
+                <w:sz w:val="18"/>
+              </w:rPr>
+              <w:t>15% (standard)</w:t>
+              <w:br/>
+              <w:t>10% for certain IP</w:t>
+            </w:r>
+          </w:p>
+        </w:tc>
+        <w:tc>
+          <w:tcPr>
+            <w:tcW w:type="dxa" w:w="2493"/>
+            <w:shd w:fill="f0f4f8" w:val="clear"/>
+          </w:tcPr>
+          <w:p>
+            <w:r>
+              <w:rPr>
+                <w:sz w:val="18"/>
+              </w:rPr>
+              <w:t>Form 1116</w:t>
+            </w:r>
+          </w:p>
+        </w:tc>
+      </w:tr>
+      <w:tr>
+        <w:tc>
+          <w:tcPr>
+            <w:tcW w:type="dxa" w:w="2493"/>
+          </w:tcPr>
+          <w:p>
+            <w:r>
+              <w:rPr>
+                <w:sz w:val="18"/>
+              </w:rPr>
+              <w:t>Capital Gains (양도소득)</w:t>
+            </w:r>
+          </w:p>
+        </w:tc>
+        <w:tc>
+          <w:tcPr>
+            <w:tcW w:type="dxa" w:w="2493"/>
+          </w:tcPr>
+          <w:p>
+            <w:r>
+              <w:rPr>
+                <w:sz w:val="18"/>
+              </w:rPr>
+              <w:t>May be taxed</w:t>
+              <w:br/>
+              <w:t>in Korea</w:t>
+            </w:r>
+          </w:p>
+        </w:tc>
+        <w:tc>
+          <w:tcPr>
+            <w:tcW w:type="dxa" w:w="2493"/>
+          </w:tcPr>
+          <w:p>
+            <w:r>
+              <w:rPr>
+                <w:sz w:val="18"/>
+              </w:rPr>
+              <w:t>Generally only taxed in</w:t>
+              <w:br/>
+              <w:t>country of residence</w:t>
+              <w:br/>
+              <w:t>(unless real property)</w:t>
+            </w:r>
+          </w:p>
+        </w:tc>
+        <w:tc>
+          <w:tcPr>
+            <w:tcW w:type="dxa" w:w="2493"/>
+          </w:tcPr>
+          <w:p>
+            <w:r>
+              <w:rPr>
+                <w:sz w:val="18"/>
+              </w:rPr>
+              <w:t>Form 1116 + Schedule D</w:t>
+              <w:br/>
+              <w:t>(if US-situs)</w:t>
+            </w:r>
+          </w:p>
+        </w:tc>
+      </w:tr>
+      <w:tr>
+        <w:tc>
+          <w:tcPr>
+            <w:tcW w:type="dxa" w:w="2493"/>
+            <w:shd w:fill="f0f4f8" w:val="clear"/>
+          </w:tcPr>
+          <w:p>
+            <w:r>
+              <w:rPr>
+                <w:sz w:val="18"/>
+              </w:rPr>
+              <w:t>Branch Profits</w:t>
+            </w:r>
+          </w:p>
+        </w:tc>
+        <w:tc>
+          <w:tcPr>
+            <w:tcW w:type="dxa" w:w="2493"/>
+            <w:shd w:fill="f0f4f8" w:val="clear"/>
+          </w:tcPr>
+          <w:p>
+            <w:r>
+              <w:rPr>
+                <w:sz w:val="18"/>
+              </w:rPr>
+              <w:t>20%+ branch tax</w:t>
+            </w:r>
+          </w:p>
+        </w:tc>
+        <w:tc>
+          <w:tcPr>
+            <w:tcW w:type="dxa" w:w="2493"/>
+            <w:shd w:fill="f0f4f8" w:val="clear"/>
+          </w:tcPr>
+          <w:p>
+            <w:r>
+              <w:rPr>
+                <w:sz w:val="18"/>
+              </w:rPr>
+              <w:t>N/A — Korean corporation</w:t>
+              <w:br/>
+              <w:t>is separate entity</w:t>
+            </w:r>
+          </w:p>
+        </w:tc>
+        <w:tc>
+          <w:tcPr>
+            <w:tcW w:type="dxa" w:w="2493"/>
+            <w:shd w:fill="f0f4f8" w:val="clear"/>
+          </w:tcPr>
+          <w:p>
+            <w:r>
+              <w:rPr>
+                <w:sz w:val="18"/>
+              </w:rPr>
+              <w:t>N/A</w:t>
+            </w:r>
+          </w:p>
+        </w:tc>
+      </w:tr>
+    </w:tbl>
+    <w:p/>
+    <w:p>
+      <w:r>
+        <w:t>Key Points:</w:t>
+        <w:br/>
+        <w:t>• Korean withholding tax on dividends (10-15%) is CREDITABLE against U.S. tax liability via Form 1116</w:t>
+        <w:br/>
+        <w:t>• If U.S. tax &gt; Korean tax: pay the difference to IRS. If Korean tax &gt; U.S. tax: carry forward excess credits</w:t>
+        <w:br/>
+        <w:t>• Form 8833 must be filed with U.S. return when claiming treaty benefits (generally required for ≥10% ownership)</w:t>
+        <w:br/>
+        <w:t>• Treaty benefit limitations: must be a "qualified resident" of the U.S. under Article 16 (Limitation on Benefits)</w:t>
+        <w:br/>
+        <w:t>• U.S. citizens are ALWAYS taxed on worldwide income regardless of residence — treaty does not override this</w:t>
+      </w:r>
+    </w:p>
+    <w:p>
+      <w:pPr>
+        <w:pStyle w:val="Heading2"/>
+      </w:pPr>
+      <w:r>
+        <w:rPr>
+          <w:color w:val="1A3450"/>
+        </w:rPr>
+        <w:t>7.5 Annual U.S. Compliance Obligations (Ongoing)</w:t>
+      </w:r>
+    </w:p>
+    <w:tbl>
+      <w:tblPr>
+        <w:tblStyle w:val="TableGrid"/>
+        <w:tblW w:type="auto" w:w="0"/>
+        <w:jc w:val="center"/>
+        <w:tblLook w:firstColumn="1" w:firstRow="1" w:lastColumn="0" w:lastRow="0" w:noHBand="0" w:noVBand="1" w:val="04A0"/>
+      </w:tblPr>
+      <w:tblGrid>
+        <w:gridCol w:w="1994"/>
+        <w:gridCol w:w="1994"/>
+        <w:gridCol w:w="1994"/>
+        <w:gridCol w:w="1994"/>
+        <w:gridCol w:w="1994"/>
+      </w:tblGrid>
+      <w:tr>
+        <w:tc>
+          <w:tcPr>
+            <w:tcW w:type="dxa" w:w="1994"/>
+            <w:shd w:fill="1a3450" w:val="clear"/>
+          </w:tcPr>
+          <w:p>
+            <w:pPr>
+              <w:jc w:val="center"/>
+            </w:pPr>
+            <w:r>
+              <w:rPr>
+                <w:b/>
+                <w:color w:val="FFFFFF"/>
+                <w:sz w:val="18"/>
+              </w:rPr>
+              <w:t>Form</w:t>
+            </w:r>
+          </w:p>
+        </w:tc>
+        <w:tc>
+          <w:tcPr>
+            <w:tcW w:type="dxa" w:w="1994"/>
+            <w:shd w:fill="1a3450" w:val="clear"/>
+          </w:tcPr>
+          <w:p>
+            <w:pPr>
+              <w:jc w:val="center"/>
+            </w:pPr>
+            <w:r>
+              <w:rPr>
+                <w:b/>
+                <w:color w:val="FFFFFF"/>
+                <w:sz w:val="18"/>
+              </w:rPr>
+              <w:t>Name</w:t>
+            </w:r>
+          </w:p>
+        </w:tc>
+        <w:tc>
+          <w:tcPr>
+            <w:tcW w:type="dxa" w:w="1994"/>
+            <w:shd w:fill="1a3450" w:val="clear"/>
+          </w:tcPr>
+          <w:p>
+            <w:pPr>
+              <w:jc w:val="center"/>
+            </w:pPr>
+            <w:r>
+              <w:rPr>
+                <w:b/>
+                <w:color w:val="FFFFFF"/>
+                <w:sz w:val="18"/>
+              </w:rPr>
+              <w:t>Threshold</w:t>
+            </w:r>
+          </w:p>
+        </w:tc>
+        <w:tc>
+          <w:tcPr>
+            <w:tcW w:type="dxa" w:w="1994"/>
+            <w:shd w:fill="1a3450" w:val="clear"/>
+          </w:tcPr>
+          <w:p>
+            <w:pPr>
+              <w:jc w:val="center"/>
+            </w:pPr>
+            <w:r>
+              <w:rPr>
+                <w:b/>
+                <w:color w:val="FFFFFF"/>
+                <w:sz w:val="18"/>
+              </w:rPr>
+              <w:t>Deadline</w:t>
+            </w:r>
+          </w:p>
+        </w:tc>
+        <w:tc>
+          <w:tcPr>
+            <w:tcW w:type="dxa" w:w="1994"/>
+            <w:shd w:fill="1a3450" w:val="clear"/>
+          </w:tcPr>
+          <w:p>
+            <w:pPr>
+              <w:jc w:val="center"/>
+            </w:pPr>
+            <w:r>
+              <w:rPr>
+                <w:b/>
+                <w:color w:val="FFFFFF"/>
+                <w:sz w:val="18"/>
+              </w:rPr>
+              <w:t>Penalty for Non-Compliance</w:t>
+            </w:r>
+          </w:p>
+        </w:tc>
+      </w:tr>
+      <w:tr>
+        <w:tc>
+          <w:tcPr>
+            <w:tcW w:type="dxa" w:w="1994"/>
+            <w:shd w:fill="f0f4f8" w:val="clear"/>
+          </w:tcPr>
+          <w:p>
+            <w:r>
+              <w:rPr>
+                <w:sz w:val="18"/>
+              </w:rPr>
+              <w:t>Form 5471</w:t>
+            </w:r>
+          </w:p>
+        </w:tc>
+        <w:tc>
+          <w:tcPr>
+            <w:tcW w:type="dxa" w:w="1994"/>
+            <w:shd w:fill="f0f4f8" w:val="clear"/>
+          </w:tcPr>
+          <w:p>
+            <w:r>
+              <w:rPr>
+                <w:sz w:val="18"/>
+              </w:rPr>
+              <w:t>Information Return of U.S. Persons</w:t>
+              <w:br/>
+              <w:t>with Respect to Certain Foreign</w:t>
+              <w:br/>
+              <w:t>Corporations</w:t>
+            </w:r>
+          </w:p>
+        </w:tc>
+        <w:tc>
+          <w:tcPr>
+            <w:tcW w:type="dxa" w:w="1994"/>
+            <w:shd w:fill="f0f4f8" w:val="clear"/>
+          </w:tcPr>
+          <w:p>
+            <w:r>
+              <w:rPr>
+                <w:sz w:val="18"/>
+              </w:rPr>
+              <w:t>10%+ ownership of a foreign</w:t>
+              <w:br/>
+              <w:t>corporation (Category 3 filer</w:t>
+              <w:br/>
+              <w:t>for 90% shareholder)</w:t>
+            </w:r>
+          </w:p>
+        </w:tc>
+        <w:tc>
+          <w:tcPr>
+            <w:tcW w:type="dxa" w:w="1994"/>
+            <w:shd w:fill="f0f4f8" w:val="clear"/>
+          </w:tcPr>
+          <w:p>
+            <w:r>
+              <w:rPr>
+                <w:sz w:val="18"/>
+              </w:rPr>
+              <w:t>Due with tax return</w:t>
+              <w:br/>
+              <w:t>(Apr 15 + extensions)</w:t>
+            </w:r>
+          </w:p>
+        </w:tc>
+        <w:tc>
+          <w:tcPr>
+            <w:tcW w:type="dxa" w:w="1994"/>
+            <w:shd w:fill="f0f4f8" w:val="clear"/>
+          </w:tcPr>
+          <w:p>
+            <w:r>
+              <w:rPr>
+                <w:sz w:val="18"/>
+              </w:rPr>
+              <w:t>$10,000 per form per year;</w:t>
+              <w:br/>
+              <w:t>additional $10,000–50,000</w:t>
+              <w:br/>
+              <w:t>for continued failure</w:t>
+              <w:br/>
+              <w:t>after IRS notice</w:t>
+            </w:r>
+          </w:p>
+        </w:tc>
+      </w:tr>
+      <w:tr>
+        <w:tc>
+          <w:tcPr>
+            <w:tcW w:type="dxa" w:w="1994"/>
+          </w:tcPr>
+          <w:p>
+            <w:r>
+              <w:rPr>
+                <w:sz w:val="18"/>
+              </w:rPr>
+              <w:t>FBAR</w:t>
+              <w:br/>
+              <w:t>(FinCEN 114)</w:t>
+            </w:r>
+          </w:p>
+        </w:tc>
+        <w:tc>
+          <w:tcPr>
+            <w:tcW w:type="dxa" w:w="1994"/>
+          </w:tcPr>
+          <w:p>
+            <w:r>
+              <w:rPr>
+                <w:sz w:val="18"/>
+              </w:rPr>
+              <w:t>Report of Foreign Bank</w:t>
+              <w:br/>
+              <w:t>and Financial Accounts</w:t>
+            </w:r>
+          </w:p>
+        </w:tc>
+        <w:tc>
+          <w:tcPr>
+            <w:tcW w:type="dxa" w:w="1994"/>
+          </w:tcPr>
+          <w:p>
+            <w:r>
+              <w:rPr>
+                <w:sz w:val="18"/>
+              </w:rPr>
+              <w:t>Aggregate foreign accounts</w:t>
+              <w:br/>
+              <w:t>&gt;$10,000 at any time</w:t>
+            </w:r>
+          </w:p>
+        </w:tc>
+        <w:tc>
+          <w:tcPr>
+            <w:tcW w:type="dxa" w:w="1994"/>
+          </w:tcPr>
+          <w:p>
+            <w:r>
+              <w:rPr>
+                <w:sz w:val="18"/>
+              </w:rPr>
+              <w:t>April 15 (auto-extension</w:t>
+              <w:br/>
+              <w:t>to Oct 15)</w:t>
+            </w:r>
+          </w:p>
+        </w:tc>
+        <w:tc>
+          <w:tcPr>
+            <w:tcW w:type="dxa" w:w="1994"/>
+          </w:tcPr>
+          <w:p>
+            <w:r>
+              <w:rPr>
+                <w:sz w:val="18"/>
+              </w:rPr>
+              <w:t>$10,000+ per violation</w:t>
+              <w:br/>
+              <w:t>(if non-willful); greater of</w:t>
+              <w:br/>
+              <w:t>$100,000 or 50% of account</w:t>
+              <w:br/>
+              <w:t>balance if willful</w:t>
+            </w:r>
+          </w:p>
+        </w:tc>
+      </w:tr>
+      <w:tr>
+        <w:tc>
+          <w:tcPr>
+            <w:tcW w:type="dxa" w:w="1994"/>
+            <w:shd w:fill="f0f4f8" w:val="clear"/>
+          </w:tcPr>
+          <w:p>
+            <w:r>
+              <w:rPr>
+                <w:sz w:val="18"/>
+              </w:rPr>
+              <w:t>Form 8938</w:t>
+            </w:r>
+          </w:p>
+        </w:tc>
+        <w:tc>
+          <w:tcPr>
+            <w:tcW w:type="dxa" w:w="1994"/>
+            <w:shd w:fill="f0f4f8" w:val="clear"/>
+          </w:tcPr>
+          <w:p>
+            <w:r>
+              <w:rPr>
+                <w:sz w:val="18"/>
+              </w:rPr>
+              <w:t>Statement of Specified</w:t>
+              <w:br/>
+              <w:t>Foreign Financial Assets</w:t>
+              <w:br/>
+              <w:t>(FATCA)</w:t>
+            </w:r>
+          </w:p>
+        </w:tc>
+        <w:tc>
+          <w:tcPr>
+            <w:tcW w:type="dxa" w:w="1994"/>
+            <w:shd w:fill="f0f4f8" w:val="clear"/>
+          </w:tcPr>
+          <w:p>
+            <w:r>
+              <w:rPr>
+                <w:sz w:val="18"/>
+              </w:rPr>
+              <w:t>&gt;$200,000 on Dec 31</w:t>
+              <w:br/>
+              <w:t>(or &gt;$300,000 at any time)</w:t>
+              <w:br/>
+              <w:t>Single filer thresholds</w:t>
+            </w:r>
+          </w:p>
+        </w:tc>
+        <w:tc>
+          <w:tcPr>
+            <w:tcW w:type="dxa" w:w="1994"/>
+            <w:shd w:fill="f0f4f8" w:val="clear"/>
+          </w:tcPr>
+          <w:p>
+            <w:r>
+              <w:rPr>
+                <w:sz w:val="18"/>
+              </w:rPr>
+              <w:t>Due with tax return</w:t>
+            </w:r>
+          </w:p>
+        </w:tc>
+        <w:tc>
+          <w:tcPr>
+            <w:tcW w:type="dxa" w:w="1994"/>
+            <w:shd w:fill="f0f4f8" w:val="clear"/>
+          </w:tcPr>
+          <w:p>
+            <w:r>
+              <w:rPr>
+                <w:sz w:val="18"/>
+              </w:rPr>
+              <w:t>$10,000 initial + $10,000</w:t>
+              <w:br/>
+              <w:t>per 30 days (max $60,000)</w:t>
+            </w:r>
+          </w:p>
+        </w:tc>
+      </w:tr>
+      <w:tr>
+        <w:tc>
+          <w:tcPr>
+            <w:tcW w:type="dxa" w:w="1994"/>
+          </w:tcPr>
+          <w:p>
+            <w:r>
+              <w:rPr>
+                <w:sz w:val="18"/>
+              </w:rPr>
+              <w:t>Form 1116</w:t>
+            </w:r>
+          </w:p>
+        </w:tc>
+        <w:tc>
+          <w:tcPr>
+            <w:tcW w:type="dxa" w:w="1994"/>
+          </w:tcPr>
+          <w:p>
+            <w:r>
+              <w:rPr>
+                <w:sz w:val="18"/>
+              </w:rPr>
+              <w:t>Foreign Tax Credit</w:t>
+            </w:r>
+          </w:p>
+        </w:tc>
+        <w:tc>
+          <w:tcPr>
+            <w:tcW w:type="dxa" w:w="1994"/>
+          </w:tcPr>
+          <w:p>
+            <w:r>
+              <w:rPr>
+                <w:sz w:val="18"/>
+              </w:rPr>
+              <w:t>Any foreign taxes paid</w:t>
+              <w:br/>
+              <w:t>or accrued</w:t>
+            </w:r>
+          </w:p>
+        </w:tc>
+        <w:tc>
+          <w:tcPr>
+            <w:tcW w:type="dxa" w:w="1994"/>
+          </w:tcPr>
+          <w:p>
+            <w:r>
+              <w:rPr>
+                <w:sz w:val="18"/>
+              </w:rPr>
+              <w:t>Due with tax return</w:t>
+            </w:r>
+          </w:p>
+        </w:tc>
+        <w:tc>
+          <w:tcPr>
+            <w:tcW w:type="dxa" w:w="1994"/>
+          </w:tcPr>
+          <w:p>
+            <w:r>
+              <w:rPr>
+                <w:sz w:val="18"/>
+              </w:rPr>
+              <w:t>Loss of credit (pay double tax</w:t>
+              <w:br/>
+              <w:t>on same income)</w:t>
+            </w:r>
+          </w:p>
+        </w:tc>
+      </w:tr>
+      <w:tr>
+        <w:tc>
+          <w:tcPr>
+            <w:tcW w:type="dxa" w:w="1994"/>
+            <w:shd w:fill="f0f4f8" w:val="clear"/>
+          </w:tcPr>
+          <w:p>
+            <w:r>
+              <w:rPr>
+                <w:sz w:val="18"/>
+              </w:rPr>
+              <w:t>Form 8833</w:t>
+            </w:r>
+          </w:p>
+        </w:tc>
+        <w:tc>
+          <w:tcPr>
+            <w:tcW w:type="dxa" w:w="1994"/>
+            <w:shd w:fill="f0f4f8" w:val="clear"/>
+          </w:tcPr>
+          <w:p>
+            <w:r>
+              <w:rPr>
+                <w:sz w:val="18"/>
+              </w:rPr>
+              <w:t>Treaty-Based Return</w:t>
+              <w:br/>
+              <w:t>Position Disclosure</w:t>
+            </w:r>
+          </w:p>
+        </w:tc>
+        <w:tc>
+          <w:tcPr>
+            <w:tcW w:type="dxa" w:w="1994"/>
+            <w:shd w:fill="f0f4f8" w:val="clear"/>
+          </w:tcPr>
+          <w:p>
+            <w:r>
+              <w:rPr>
+                <w:sz w:val="18"/>
+              </w:rPr>
+              <w:t>Generally required when</w:t>
+              <w:br/>
+              <w:t>claiming treaty benefits with</w:t>
+              <w:br/>
+              <w:t>≥10% ownership</w:t>
+            </w:r>
+          </w:p>
+        </w:tc>
+        <w:tc>
+          <w:tcPr>
+            <w:tcW w:type="dxa" w:w="1994"/>
+            <w:shd w:fill="f0f4f8" w:val="clear"/>
+          </w:tcPr>
+          <w:p>
+            <w:r>
+              <w:rPr>
+                <w:sz w:val="18"/>
+              </w:rPr>
+              <w:t>Due with tax return</w:t>
+            </w:r>
+          </w:p>
+        </w:tc>
+        <w:tc>
+          <w:tcPr>
+            <w:tcW w:type="dxa" w:w="1994"/>
+            <w:shd w:fill="f0f4f8" w:val="clear"/>
+          </w:tcPr>
+          <w:p>
+            <w:r>
+              <w:rPr>
+                <w:sz w:val="18"/>
+              </w:rPr>
+              <w:t>Potential $1,000 penalty</w:t>
+              <w:br/>
+              <w:t>(rarely enforced, but</w:t>
+              <w:br/>
+              <w:t>failure = weaker audit</w:t>
+              <w:br/>
+              <w:t>position)</w:t>
+            </w:r>
+          </w:p>
+        </w:tc>
+      </w:tr>
+      <w:tr>
+        <w:tc>
+          <w:tcPr>
+            <w:tcW w:type="dxa" w:w="1994"/>
+          </w:tcPr>
+          <w:p>
+            <w:r>
+              <w:rPr>
+                <w:sz w:val="18"/>
+              </w:rPr>
+              <w:t>Form 926</w:t>
+            </w:r>
+          </w:p>
+        </w:tc>
+        <w:tc>
+          <w:tcPr>
+            <w:tcW w:type="dxa" w:w="1994"/>
+          </w:tcPr>
+          <w:p>
+            <w:r>
+              <w:rPr>
+                <w:sz w:val="18"/>
+              </w:rPr>
+              <w:t>Return by a Transferor of</w:t>
+              <w:br/>
+              <w:t>Property to a Foreign</w:t>
+              <w:br/>
+              <w:t>Corporation</w:t>
+            </w:r>
+          </w:p>
+        </w:tc>
+        <w:tc>
+          <w:tcPr>
+            <w:tcW w:type="dxa" w:w="1994"/>
+          </w:tcPr>
+          <w:p>
+            <w:r>
+              <w:rPr>
+                <w:sz w:val="18"/>
+              </w:rPr>
+              <w:t>Transfer of property</w:t>
+              <w:br/>
+              <w:t>(including cash) to foreign</w:t>
+              <w:br/>
+              <w:t>corporation</w:t>
+            </w:r>
+          </w:p>
+        </w:tc>
+        <w:tc>
+          <w:tcPr>
+            <w:tcW w:type="dxa" w:w="1994"/>
+          </w:tcPr>
+          <w:p>
+            <w:r>
+              <w:rPr>
+                <w:sz w:val="18"/>
+              </w:rPr>
+              <w:t>Due with tax return</w:t>
+            </w:r>
+          </w:p>
+        </w:tc>
+        <w:tc>
+          <w:tcPr>
+            <w:tcW w:type="dxa" w:w="1994"/>
+          </w:tcPr>
+          <w:p>
+            <w:r>
+              <w:rPr>
+                <w:sz w:val="18"/>
+              </w:rPr>
+              <w:t>$10,000+ per failure</w:t>
+            </w:r>
+          </w:p>
+        </w:tc>
+      </w:tr>
+    </w:tbl>
+    <w:p/>
+    <w:p>
+      <w:r>
+        <w:t>⚠️ IMPORTANT NOTES:</w:t>
+        <w:br/>
+        <w:t>• Form 5471 is the HIGHEST RISK compliance item for a 90% shareholder</w:t>
+        <w:br/>
+        <w:t xml:space="preserve">  - Section 6038 requires detailed financial reporting of the Korean corporation</w:t>
+        <w:br/>
+        <w:t xml:space="preserve">  - Korean GAAP financials must be translated/reconciled to U.S. GAAP</w:t>
+        <w:br/>
+        <w:t xml:space="preserve">  - Schedule G (income statement), Schedule H (balance sheet), Schedule M (transactions)</w:t>
+        <w:br/>
+        <w:t xml:space="preserve">  - The penalty of $10,000 applies EVEN IF NO TAX IS DUE</w:t>
+        <w:br/>
+        <w:br/>
+        <w:t>• The Korean corporation must provide the following annually to the investor's CPA:</w:t>
+        <w:br/>
+        <w:t xml:space="preserve">  - Full financial statements (K-GAAP or IFRS) + Korean tax return</w:t>
+        <w:br/>
+        <w:t xml:space="preserve">  - Shareholder registry confirming ownership percentage</w:t>
+        <w:br/>
+        <w:t xml:space="preserve">  - All related-party transaction details (investor ↔ corporation)</w:t>
+        <w:br/>
+        <w:t xml:space="preserve">  - Details of any capital increases, share transfers, or structural changes</w:t>
+        <w:br/>
+        <w:br/>
+        <w:t>• Exchange Rate:</w:t>
+        <w:br/>
+        <w:t xml:space="preserve">  - Use year-end rate (Dec 31) for balance sheet items</w:t>
+        <w:br/>
+        <w:t xml:space="preserve">  - Use average annual rate for income statement items</w:t>
+        <w:br/>
+        <w:t xml:space="preserve">  - Track the exchange rate at each capital contribution date for basis purposes</w:t>
+      </w:r>
+    </w:p>
+    <w:p>
+      <w:pPr>
+        <w:pStyle w:val="Heading2"/>
+      </w:pPr>
+      <w:r>
+        <w:rPr>
+          <w:color w:val="1A3450"/>
+        </w:rPr>
+        <w:t>7.6 Integrated Tax Compliance Timeline</w:t>
+      </w:r>
+    </w:p>
+    <w:tbl>
+      <w:tblPr>
+        <w:tblStyle w:val="TableGrid"/>
+        <w:tblW w:type="auto" w:w="0"/>
+        <w:jc w:val="center"/>
+        <w:tblLook w:firstColumn="1" w:firstRow="1" w:lastColumn="0" w:lastRow="0" w:noHBand="0" w:noVBand="1" w:val="04A0"/>
+      </w:tblPr>
+      <w:tblGrid>
+        <w:gridCol w:w="2493"/>
+        <w:gridCol w:w="2493"/>
+        <w:gridCol w:w="2493"/>
+        <w:gridCol w:w="2493"/>
+      </w:tblGrid>
+      <w:tr>
+        <w:tc>
+          <w:tcPr>
+            <w:tcW w:type="dxa" w:w="2493"/>
+            <w:shd w:fill="1a3450" w:val="clear"/>
+          </w:tcPr>
+          <w:p>
+            <w:pPr>
+              <w:jc w:val="center"/>
+            </w:pPr>
+            <w:r>
+              <w:rPr>
+                <w:b/>
+                <w:color w:val="FFFFFF"/>
+                <w:sz w:val="18"/>
+              </w:rPr>
+              <w:t>When</w:t>
+            </w:r>
+          </w:p>
+        </w:tc>
+        <w:tc>
+          <w:tcPr>
+            <w:tcW w:type="dxa" w:w="2493"/>
+            <w:shd w:fill="1a3450" w:val="clear"/>
+          </w:tcPr>
+          <w:p>
+            <w:pPr>
+              <w:jc w:val="center"/>
+            </w:pPr>
+            <w:r>
+              <w:rPr>
+                <w:b/>
+                <w:color w:val="FFFFFF"/>
+                <w:sz w:val="18"/>
+              </w:rPr>
+              <w:t>Action</w:t>
+            </w:r>
+          </w:p>
+        </w:tc>
+        <w:tc>
+          <w:tcPr>
+            <w:tcW w:type="dxa" w:w="2493"/>
+            <w:shd w:fill="1a3450" w:val="clear"/>
+          </w:tcPr>
+          <w:p>
+            <w:pPr>
+              <w:jc w:val="center"/>
+            </w:pPr>
+            <w:r>
+              <w:rPr>
+                <w:b/>
+                <w:color w:val="FFFFFF"/>
+                <w:sz w:val="18"/>
+              </w:rPr>
+              <w:t>Who</w:t>
+            </w:r>
+          </w:p>
+        </w:tc>
+        <w:tc>
+          <w:tcPr>
+            <w:tcW w:type="dxa" w:w="2493"/>
+            <w:shd w:fill="1a3450" w:val="clear"/>
+          </w:tcPr>
+          <w:p>
+            <w:pPr>
+              <w:jc w:val="center"/>
+            </w:pPr>
+            <w:r>
+              <w:rPr>
+                <w:b/>
+                <w:color w:val="FFFFFF"/>
+                <w:sz w:val="18"/>
+              </w:rPr>
+              <w:t>Deliverable / Result</w:t>
+            </w:r>
+          </w:p>
+        </w:tc>
+      </w:tr>
+      <w:tr>
+        <w:tc>
+          <w:tcPr>
+            <w:tcW w:type="dxa" w:w="2493"/>
+            <w:shd w:fill="f0f4f8" w:val="clear"/>
+          </w:tcPr>
+          <w:p>
+            <w:r>
+              <w:rPr>
+                <w:sz w:val="18"/>
+              </w:rPr>
+              <w:t>NOW</w:t>
+              <w:br/>
+              <w:t>(Jun 2026)</w:t>
+            </w:r>
+          </w:p>
+        </w:tc>
+        <w:tc>
+          <w:tcPr>
+            <w:tcW w:type="dxa" w:w="2493"/>
+            <w:shd w:fill="f0f4f8" w:val="clear"/>
+          </w:tcPr>
+          <w:p>
+            <w:r>
+              <w:rPr>
+                <w:sz w:val="18"/>
+              </w:rPr>
+              <w:t>① Engage U.S. cross-border CPA</w:t>
+              <w:br/>
+              <w:t>② PFIC analysis opinion letter</w:t>
+              <w:br/>
+              <w:t>③ Ownership structure decision</w:t>
+              <w:br/>
+              <w:t>④ Open tracking spreadsheet for basis/FX</w:t>
+            </w:r>
+          </w:p>
+        </w:tc>
+        <w:tc>
+          <w:tcPr>
+            <w:tcW w:type="dxa" w:w="2493"/>
+            <w:shd w:fill="f0f4f8" w:val="clear"/>
+          </w:tcPr>
+          <w:p>
+            <w:r>
+              <w:rPr>
+                <w:sz w:val="18"/>
+              </w:rPr>
+              <w:t>Investor + CPA</w:t>
+            </w:r>
+          </w:p>
+        </w:tc>
+        <w:tc>
+          <w:tcPr>
+            <w:tcW w:type="dxa" w:w="2493"/>
+            <w:shd w:fill="f0f4f8" w:val="clear"/>
+          </w:tcPr>
+          <w:p>
+            <w:r>
+              <w:rPr>
+                <w:sz w:val="18"/>
+              </w:rPr>
+              <w:t>CPA engagement letter;</w:t>
+              <w:br/>
+              <w:t>PFIC non-classification opinion;</w:t>
+              <w:br/>
+              <w:t>FX tracking sheet created</w:t>
+            </w:r>
+          </w:p>
+        </w:tc>
+      </w:tr>
+      <w:tr>
+        <w:tc>
+          <w:tcPr>
+            <w:tcW w:type="dxa" w:w="2493"/>
+          </w:tcPr>
+          <w:p>
+            <w:r>
+              <w:rPr>
+                <w:sz w:val="18"/>
+              </w:rPr>
+              <w:t>Jul 15, 2026</w:t>
+            </w:r>
+          </w:p>
+        </w:tc>
+        <w:tc>
+          <w:tcPr>
+            <w:tcW w:type="dxa" w:w="2493"/>
+          </w:tcPr>
+          <w:p>
+            <w:r>
+              <w:rPr>
+                <w:sz w:val="18"/>
+              </w:rPr>
+              <w:t>⑤ Sign shareholder agreement</w:t>
+              <w:br/>
+              <w:t>⑥ Prepare source-of-funds documentation</w:t>
+            </w:r>
+          </w:p>
+        </w:tc>
+        <w:tc>
+          <w:tcPr>
+            <w:tcW w:type="dxa" w:w="2493"/>
+          </w:tcPr>
+          <w:p>
+            <w:r>
+              <w:rPr>
+                <w:sz w:val="18"/>
+              </w:rPr>
+              <w:t>Investor + CEO</w:t>
+            </w:r>
+          </w:p>
+        </w:tc>
+        <w:tc>
+          <w:tcPr>
+            <w:tcW w:type="dxa" w:w="2493"/>
+          </w:tcPr>
+          <w:p>
+            <w:r>
+              <w:rPr>
+                <w:sz w:val="18"/>
+              </w:rPr>
+              <w:t>Signed agreement;</w:t>
+              <w:br/>
+              <w:t>bank statements, tax returns</w:t>
+            </w:r>
+          </w:p>
+        </w:tc>
+      </w:tr>
+      <w:tr>
+        <w:tc>
+          <w:tcPr>
+            <w:tcW w:type="dxa" w:w="2493"/>
+            <w:shd w:fill="f0f4f8" w:val="clear"/>
+          </w:tcPr>
+          <w:p>
+            <w:r>
+              <w:rPr>
+                <w:sz w:val="18"/>
+              </w:rPr>
+              <w:t>Jul 20–25, 2026</w:t>
+              <w:br/>
+              <w:t>(FDI Stage)</w:t>
+            </w:r>
+          </w:p>
+        </w:tc>
+        <w:tc>
+          <w:tcPr>
+            <w:tcW w:type="dxa" w:w="2493"/>
+            <w:shd w:fill="f0f4f8" w:val="clear"/>
+          </w:tcPr>
+          <w:p>
+            <w:r>
+              <w:rPr>
+                <w:sz w:val="18"/>
+              </w:rPr>
+              <w:t>⑦ File foreign investment notification (KOTRA)</w:t>
+              <w:br/>
+              <w:t>⑧ Transfer investment funds (track USD-KRW rate!)</w:t>
+              <w:br/>
+              <w:t>⑨ Obtain FDI registration certificate</w:t>
+            </w:r>
+          </w:p>
+        </w:tc>
+        <w:tc>
+          <w:tcPr>
+            <w:tcW w:type="dxa" w:w="2493"/>
+            <w:shd w:fill="f0f4f8" w:val="clear"/>
+          </w:tcPr>
+          <w:p>
+            <w:r>
+              <w:rPr>
+                <w:sz w:val="18"/>
+              </w:rPr>
+              <w:t>CEO (with investor POA)</w:t>
+            </w:r>
+          </w:p>
+        </w:tc>
+        <w:tc>
+          <w:tcPr>
+            <w:tcW w:type="dxa" w:w="2493"/>
+            <w:shd w:fill="f0f4f8" w:val="clear"/>
+          </w:tcPr>
+          <w:p>
+            <w:r>
+              <w:rPr>
+                <w:sz w:val="18"/>
+              </w:rPr>
+              <w:t>FDI certificate;</w:t>
+              <w:br/>
+              <w:t>Bank remittance receipt</w:t>
+              <w:br/>
+              <w:t>with exchange rate recorded</w:t>
+            </w:r>
+          </w:p>
+        </w:tc>
+      </w:tr>
+      <w:tr>
+        <w:tc>
+          <w:tcPr>
+            <w:tcW w:type="dxa" w:w="2493"/>
+          </w:tcPr>
+          <w:p>
+            <w:r>
+              <w:rPr>
+                <w:sz w:val="18"/>
+              </w:rPr>
+              <w:t>Aug 1–6, 2026</w:t>
+              <w:br/>
+              <w:t>(Corp. Reg.)</w:t>
+            </w:r>
+          </w:p>
+        </w:tc>
+        <w:tc>
+          <w:tcPr>
+            <w:tcW w:type="dxa" w:w="2493"/>
+          </w:tcPr>
+          <w:p>
+            <w:r>
+              <w:rPr>
+                <w:sz w:val="18"/>
+              </w:rPr>
+              <w:t>⑩ Register corporation</w:t>
+              <w:br/>
+              <w:t>⑪ Open corporate bank account</w:t>
+              <w:br/>
+              <w:t>⑫ Engage Korean 세무사</w:t>
+            </w:r>
+          </w:p>
+        </w:tc>
+        <w:tc>
+          <w:tcPr>
+            <w:tcW w:type="dxa" w:w="2493"/>
+          </w:tcPr>
+          <w:p>
+            <w:r>
+              <w:rPr>
+                <w:sz w:val="18"/>
+              </w:rPr>
+              <w:t>CEO + 법무사</w:t>
+            </w:r>
+          </w:p>
+        </w:tc>
+        <w:tc>
+          <w:tcPr>
+            <w:tcW w:type="dxa" w:w="2493"/>
+          </w:tcPr>
+          <w:p>
+            <w:r>
+              <w:rPr>
+                <w:sz w:val="18"/>
+              </w:rPr>
+              <w:t>법인등기부등본;</w:t>
+              <w:br/>
+              <w:t>세무사 engagement letter</w:t>
+            </w:r>
+          </w:p>
+        </w:tc>
+      </w:tr>
+      <w:tr>
+        <w:tc>
+          <w:tcPr>
+            <w:tcW w:type="dxa" w:w="2493"/>
+            <w:shd w:fill="f0f4f8" w:val="clear"/>
+          </w:tcPr>
+          <w:p>
+            <w:r>
+              <w:rPr>
+                <w:sz w:val="18"/>
+              </w:rPr>
+              <w:t>Aug 7–11, 2026</w:t>
+              <w:br/>
+              <w:t>(Biz Reg.)</w:t>
+            </w:r>
+          </w:p>
+        </w:tc>
+        <w:tc>
+          <w:tcPr>
+            <w:tcW w:type="dxa" w:w="2493"/>
+            <w:shd w:fill="f0f4f8" w:val="clear"/>
+          </w:tcPr>
+          <w:p>
+            <w:r>
+              <w:rPr>
+                <w:sz w:val="18"/>
+              </w:rPr>
+              <w:t>⑬ Register for business (사업자등록)</w:t>
+              <w:br/>
+              <w:t>⑭ Register for VAT</w:t>
+              <w:br/>
+              <w:t>⑮ Apply for corporate tax ID (법인세 납세번호)</w:t>
+            </w:r>
+          </w:p>
+        </w:tc>
+        <w:tc>
+          <w:tcPr>
+            <w:tcW w:type="dxa" w:w="2493"/>
+            <w:shd w:fill="f0f4f8" w:val="clear"/>
+          </w:tcPr>
+          <w:p>
+            <w:r>
+              <w:rPr>
+                <w:sz w:val="18"/>
+              </w:rPr>
+              <w:t>CEO + 세무사</w:t>
+            </w:r>
+          </w:p>
+        </w:tc>
+        <w:tc>
+          <w:tcPr>
+            <w:tcW w:type="dxa" w:w="2493"/>
+            <w:shd w:fill="f0f4f8" w:val="clear"/>
+          </w:tcPr>
+          <w:p>
+            <w:r>
+              <w:rPr>
+                <w:sz w:val="18"/>
+              </w:rPr>
+              <w:t>사업자등록증;</w:t>
+              <w:br/>
+              <w:t>NTS taxpayer number</w:t>
+            </w:r>
+          </w:p>
+        </w:tc>
+      </w:tr>
+      <w:tr>
+        <w:tc>
+          <w:tcPr>
+            <w:tcW w:type="dxa" w:w="2493"/>
+          </w:tcPr>
+          <w:p>
+            <w:r>
+              <w:rPr>
+                <w:sz w:val="18"/>
+              </w:rPr>
+              <w:t>Sep 2026</w:t>
+            </w:r>
+          </w:p>
+        </w:tc>
+        <w:tc>
+          <w:tcPr>
+            <w:tcW w:type="dxa" w:w="2493"/>
+          </w:tcPr>
+          <w:p>
+            <w:r>
+              <w:rPr>
+                <w:sz w:val="18"/>
+              </w:rPr>
+              <w:t>⑯ Apply for FIPA corporate tax reduction</w:t>
+              <w:br/>
+              <w:t>⑰ Apply for local tax exemptions (취득세/재산세)</w:t>
+              <w:br/>
+              <w:t>⑱ File FIPA incentive application (조세감면신청서)</w:t>
+            </w:r>
+          </w:p>
+        </w:tc>
+        <w:tc>
+          <w:tcPr>
+            <w:tcW w:type="dxa" w:w="2493"/>
+          </w:tcPr>
+          <w:p>
+            <w:r>
+              <w:rPr>
+                <w:sz w:val="18"/>
+              </w:rPr>
+              <w:t>세무사</w:t>
+            </w:r>
+          </w:p>
+        </w:tc>
+        <w:tc>
+          <w:tcPr>
+            <w:tcW w:type="dxa" w:w="2493"/>
+          </w:tcPr>
+          <w:p>
+            <w:r>
+              <w:rPr>
+                <w:sz w:val="18"/>
+              </w:rPr>
+              <w:t>FIPA tax benefit</w:t>
+              <w:br/>
+              <w:t>approval letter from NTS;</w:t>
+              <w:br/>
+              <w:t>Local government exemption certificates</w:t>
+            </w:r>
+          </w:p>
+        </w:tc>
+      </w:tr>
+      <w:tr>
+        <w:tc>
+          <w:tcPr>
+            <w:tcW w:type="dxa" w:w="2493"/>
+            <w:shd w:fill="f0f4f8" w:val="clear"/>
+          </w:tcPr>
+          <w:p>
+            <w:r>
+              <w:rPr>
+                <w:sz w:val="18"/>
+              </w:rPr>
+              <w:t>Oct 2026 onward</w:t>
+              <w:br/>
+              <w:t>(upon first asset purchase)</w:t>
+            </w:r>
+          </w:p>
+        </w:tc>
+        <w:tc>
+          <w:tcPr>
+            <w:tcW w:type="dxa" w:w="2493"/>
+            <w:shd w:fill="f0f4f8" w:val="clear"/>
+          </w:tcPr>
+          <w:p>
+            <w:r>
+              <w:rPr>
+                <w:sz w:val="18"/>
+              </w:rPr>
+              <w:t>⑲ For each qualifying capital goods import:</w:t>
+              <w:br/>
+              <w:t xml:space="preserve">  - Pre-file HS Code 사전심사 with 관세청</w:t>
+              <w:br/>
+              <w:t xml:space="preserve">  - Apply for customs duty exemption</w:t>
+              <w:br/>
+              <w:t xml:space="preserve">  - Keep all import documentation</w:t>
+            </w:r>
+          </w:p>
+        </w:tc>
+        <w:tc>
+          <w:tcPr>
+            <w:tcW w:type="dxa" w:w="2493"/>
+            <w:shd w:fill="f0f4f8" w:val="clear"/>
+          </w:tcPr>
+          <w:p>
+            <w:r>
+              <w:rPr>
+                <w:sz w:val="18"/>
+              </w:rPr>
+              <w:t>세무사 + 관세사</w:t>
+            </w:r>
+          </w:p>
+        </w:tc>
+        <w:tc>
+          <w:tcPr>
+            <w:tcW w:type="dxa" w:w="2493"/>
+            <w:shd w:fill="f0f4f8" w:val="clear"/>
+          </w:tcPr>
+          <w:p>
+            <w:r>
+              <w:rPr>
+                <w:sz w:val="18"/>
+              </w:rPr>
+              <w:t>Customs duty exemption;</w:t>
+              <w:br/>
+              <w:t>Asset register maintained</w:t>
+            </w:r>
+          </w:p>
+        </w:tc>
+      </w:tr>
+      <w:tr>
+        <w:tc>
+          <w:tcPr>
+            <w:tcW w:type="dxa" w:w="2493"/>
+          </w:tcPr>
+          <w:p>
+            <w:r>
+              <w:rPr>
+                <w:sz w:val="18"/>
+              </w:rPr>
+              <w:t>Mar 2027</w:t>
+              <w:br/>
+              <w:t>(First Korean tax return)</w:t>
+            </w:r>
+          </w:p>
+        </w:tc>
+        <w:tc>
+          <w:tcPr>
+            <w:tcW w:type="dxa" w:w="2493"/>
+          </w:tcPr>
+          <w:p>
+            <w:r>
+              <w:rPr>
+                <w:sz w:val="18"/>
+              </w:rPr>
+              <w:t>⑳ File first corporate tax return (법인세 신고)</w:t>
+              <w:br/>
+              <w:t>㉑ Claim FIPA tax reduction on first profit</w:t>
+              <w:br/>
+              <w:t>㉒ File VAT returns (부가세 신고 — quarterly)</w:t>
+            </w:r>
+          </w:p>
+        </w:tc>
+        <w:tc>
+          <w:tcPr>
+            <w:tcW w:type="dxa" w:w="2493"/>
+          </w:tcPr>
+          <w:p>
+            <w:r>
+              <w:rPr>
+                <w:sz w:val="18"/>
+              </w:rPr>
+              <w:t>세무사</w:t>
+            </w:r>
+          </w:p>
+        </w:tc>
+        <w:tc>
+          <w:tcPr>
+            <w:tcW w:type="dxa" w:w="2493"/>
+          </w:tcPr>
+          <w:p>
+            <w:r>
+              <w:rPr>
+                <w:sz w:val="18"/>
+              </w:rPr>
+              <w:t>Corporate tax return;</w:t>
+              <w:br/>
+              <w:t>VAT returns</w:t>
+            </w:r>
+          </w:p>
+        </w:tc>
+      </w:tr>
+      <w:tr>
+        <w:tc>
+          <w:tcPr>
+            <w:tcW w:type="dxa" w:w="2493"/>
+            <w:shd w:fill="f0f4f8" w:val="clear"/>
+          </w:tcPr>
+          <w:p>
+            <w:r>
+              <w:rPr>
+                <w:sz w:val="18"/>
+              </w:rPr>
+              <w:t>Apr 15, 2027</w:t>
+              <w:br/>
+              <w:t>(First US tax return with</w:t>
+              <w:br/>
+              <w:t>foreign holdings)</w:t>
+            </w:r>
+          </w:p>
+        </w:tc>
+        <w:tc>
+          <w:tcPr>
+            <w:tcW w:type="dxa" w:w="2493"/>
+            <w:shd w:fill="f0f4f8" w:val="clear"/>
+          </w:tcPr>
+          <w:p>
+            <w:r>
+              <w:rPr>
+                <w:sz w:val="18"/>
+              </w:rPr>
+              <w:t>㉓ Prepare Korean GAAP→US GAAP reconciliation</w:t>
+              <w:br/>
+              <w:t>㉔ File Form 5471 (Category 3) with U.S. return</w:t>
+              <w:br/>
+              <w:t>㉕ File FBAR (FinCEN 114)</w:t>
+              <w:br/>
+              <w:t>㉖ File Form 1116 (Foreign Tax Credit)</w:t>
+              <w:br/>
+              <w:t>㉗ File Form 8938 (FATCA)</w:t>
+              <w:br/>
+              <w:t>㉘ File Form 926 (if applicable)</w:t>
+              <w:br/>
+              <w:t>㉙ File Form 8833 (Treaty Disclosure)</w:t>
+            </w:r>
+          </w:p>
+        </w:tc>
+        <w:tc>
+          <w:tcPr>
+            <w:tcW w:type="dxa" w:w="2493"/>
+            <w:shd w:fill="f0f4f8" w:val="clear"/>
+          </w:tcPr>
+          <w:p>
+            <w:r>
+              <w:rPr>
+                <w:sz w:val="18"/>
+              </w:rPr>
+              <w:t>Investor + U.S. CPA</w:t>
+            </w:r>
+          </w:p>
+        </w:tc>
+        <w:tc>
+          <w:tcPr>
+            <w:tcW w:type="dxa" w:w="2493"/>
+            <w:shd w:fill="f0f4f8" w:val="clear"/>
+          </w:tcPr>
+          <w:p>
+            <w:r>
+              <w:rPr>
+                <w:sz w:val="18"/>
+              </w:rPr>
+              <w:t>U.S. tax return with all</w:t>
+              <w:br/>
+              <w:t>international information</w:t>
+              <w:br/>
+              <w:t>forms attached;</w:t>
+              <w:br/>
+              <w:t>FBAR acknowledgment</w:t>
+            </w:r>
+          </w:p>
+        </w:tc>
+      </w:tr>
+      <w:tr>
+        <w:tc>
+          <w:tcPr>
+            <w:tcW w:type="dxa" w:w="2493"/>
+          </w:tcPr>
+          <w:p>
+            <w:r>
+              <w:rPr>
+                <w:sz w:val="18"/>
+              </w:rPr>
+              <w:t>Annually thereafter</w:t>
+              <w:br/>
+              <w:t>(Apr 15 IRS / Mar 31 NTS)</w:t>
+            </w:r>
+          </w:p>
+        </w:tc>
+        <w:tc>
+          <w:tcPr>
+            <w:tcW w:type="dxa" w:w="2493"/>
+          </w:tcPr>
+          <w:p>
+            <w:r>
+              <w:rPr>
+                <w:sz w:val="18"/>
+              </w:rPr>
+              <w:t>㉚ Repeat all U.S. reporting (5471, FBAR, 8938, 1116)</w:t>
+              <w:br/>
+              <w:t>㉛ Korean corporate tax return + VAT</w:t>
+              <w:br/>
+              <w:t>㉜ Monitor FIPA benefit expiration (Year 6: corporate tax</w:t>
+              <w:br/>
+              <w:t xml:space="preserve">   drops to 50%; Year 8: ends entirely)</w:t>
+            </w:r>
+          </w:p>
+        </w:tc>
+        <w:tc>
+          <w:tcPr>
+            <w:tcW w:type="dxa" w:w="2493"/>
+          </w:tcPr>
+          <w:p>
+            <w:r>
+              <w:rPr>
+                <w:sz w:val="18"/>
+              </w:rPr>
+              <w:t>CPA + 세무사</w:t>
+              <w:br/>
+              <w:t>+ Investor</w:t>
+            </w:r>
+          </w:p>
+        </w:tc>
+        <w:tc>
+          <w:tcPr>
+            <w:tcW w:type="dxa" w:w="2493"/>
+          </w:tcPr>
+          <w:p>
+            <w:r>
+              <w:rPr>
+                <w:sz w:val="18"/>
+              </w:rPr>
+              <w:t>Annual tax filings;</w:t>
+              <w:br/>
+              <w:t>FIPA benefit tracking sheet</w:t>
+            </w:r>
+          </w:p>
+        </w:tc>
+      </w:tr>
+      <w:tr>
+        <w:tc>
+          <w:tcPr>
+            <w:tcW w:type="dxa" w:w="2493"/>
+            <w:shd w:fill="f0f4f8" w:val="clear"/>
+          </w:tcPr>
+          <w:p>
+            <w:r>
+              <w:rPr>
+                <w:sz w:val="18"/>
+              </w:rPr>
+              <w:t>Upon Dividend</w:t>
+              <w:br/>
+              <w:t>Declaration</w:t>
+            </w:r>
+          </w:p>
+        </w:tc>
+        <w:tc>
+          <w:tcPr>
+            <w:tcW w:type="dxa" w:w="2493"/>
+            <w:shd w:fill="f0f4f8" w:val="clear"/>
+          </w:tcPr>
+          <w:p>
+            <w:r>
+              <w:rPr>
+                <w:sz w:val="18"/>
+              </w:rPr>
+              <w:t>㉝ Korean withholding tax at treaty rate (10-15%)</w:t>
+              <w:br/>
+              <w:t>㉞ Korean 세무사 files reduced rate application</w:t>
+              <w:br/>
+              <w:t>㉟ U.S. CPA claims foreign tax credit (Form 1116)</w:t>
+            </w:r>
+          </w:p>
+        </w:tc>
+        <w:tc>
+          <w:tcPr>
+            <w:tcW w:type="dxa" w:w="2493"/>
+            <w:shd w:fill="f0f4f8" w:val="clear"/>
+          </w:tcPr>
+          <w:p>
+            <w:r>
+              <w:rPr>
+                <w:sz w:val="18"/>
+              </w:rPr>
+              <w:t>세무사 + CPA</w:t>
+            </w:r>
+          </w:p>
+        </w:tc>
+        <w:tc>
+          <w:tcPr>
+            <w:tcW w:type="dxa" w:w="2493"/>
+            <w:shd w:fill="f0f4f8" w:val="clear"/>
+          </w:tcPr>
+          <w:p>
+            <w:r>
+              <w:rPr>
+                <w:sz w:val="18"/>
+              </w:rPr>
+              <w:t>Dividend payment with</w:t>
+              <w:br/>
+              <w:t>treaty-reduced withholding;</w:t>
+              <w:br/>
+              <w:t>Form 1116 credit claimed</w:t>
+            </w:r>
+          </w:p>
+        </w:tc>
+      </w:tr>
+      <w:tr>
+        <w:tc>
+          <w:tcPr>
+            <w:tcW w:type="dxa" w:w="2493"/>
+          </w:tcPr>
+          <w:p>
+            <w:r>
+              <w:rPr>
+                <w:sz w:val="18"/>
+              </w:rPr>
+              <w:t>Upon Future</w:t>
+              <w:br/>
+              <w:t>Exit / Sale</w:t>
+            </w:r>
+          </w:p>
+        </w:tc>
+        <w:tc>
+          <w:tcPr>
+            <w:tcW w:type="dxa" w:w="2493"/>
+          </w:tcPr>
+          <w:p>
+            <w:r>
+              <w:rPr>
+                <w:sz w:val="18"/>
+              </w:rPr>
+              <w:t>㊱ Korean capital gains treatment (if any)</w:t>
+              <w:br/>
+              <w:t>㊲ U.S. capital gains tax on sale of foreign corp shares</w:t>
+              <w:br/>
+              <w:t>㊳ Basis calculation using tracked FX rates</w:t>
+              <w:br/>
+              <w:t>㊴ Exit tax planning with CPA 12+ months before sale</w:t>
+            </w:r>
+          </w:p>
+        </w:tc>
+        <w:tc>
+          <w:tcPr>
+            <w:tcW w:type="dxa" w:w="2493"/>
+          </w:tcPr>
+          <w:p>
+            <w:r>
+              <w:rPr>
+                <w:sz w:val="18"/>
+              </w:rPr>
+              <w:t>CPA + 세무사</w:t>
+              <w:br/>
+              <w:t>+ Investor</w:t>
+            </w:r>
+          </w:p>
+        </w:tc>
+        <w:tc>
+          <w:tcPr>
+            <w:tcW w:type="dxa" w:w="2493"/>
+          </w:tcPr>
+          <w:p>
+            <w:r>
+              <w:rPr>
+                <w:sz w:val="18"/>
+              </w:rPr>
+              <w:t>Exit tax strategy;</w:t>
+              <w:br/>
+              <w:t>Capital gains calculation</w:t>
+            </w:r>
+          </w:p>
+        </w:tc>
+      </w:tr>
+    </w:tbl>
+    <w:p/>
+    <w:p>
+      <w:pPr>
+        <w:pStyle w:val="Heading2"/>
+      </w:pPr>
+      <w:r>
+        <w:rPr>
+          <w:color w:val="1A3450"/>
+        </w:rPr>
+        <w:t>7.7 Dividend &amp; Profit Repatriation Strategy</w:t>
+      </w:r>
+    </w:p>
+    <w:p>
+      <w:r>
+        <w:t>How the investor eventually takes money out of Korea matters significantly for tax.</w:t>
+        <w:br/>
+        <w:br/>
+        <w:t>Route A — Dividend Distribution (배당):</w:t>
+        <w:br/>
+        <w:t>• Korean corp declares dividend → 10–15% Korean withholding tax → investor receives net</w:t>
+        <w:br/>
+        <w:t>• U.S. tax: dividend included in gross income; foreign tax credit for Korean withholding via Form 1116</w:t>
+        <w:br/>
+        <w:t>• Net U.S. rate: 20% qualified dividend rate – 15% credit = 5% net additional U.S. tax (approx.)</w:t>
+        <w:br/>
+        <w:t>• Best when: profits are significant and reinvestment is not needed</w:t>
+        <w:br/>
+        <w:br/>
+        <w:t>Route B — Shareholder Loan Repayment (if structured upfront):</w:t>
+        <w:br/>
+        <w:t>• Principal repayment: tax-free (no withholding)</w:t>
+        <w:br/>
+        <w:t>• Interest: subject to 12% Korean withholding (treaty rate), creditable in U.S.</w:t>
+        <w:br/>
+        <w:t>• Best when: investor provided some capital as debt (see 7.2 § Action 5)</w:t>
+        <w:br/>
+        <w:br/>
+        <w:t>Route C — Management/Consulting Fee:</w:t>
+        <w:br/>
+        <w:t>• Korean corp pays fee to U.S. investor for legitimate services (director oversight, strategic consulting)</w:t>
+        <w:br/>
+        <w:t>• Korean deduction for corp; U.S. ordinary income for investor</w:t>
+        <w:br/>
+        <w:t>• Must be at arm's length (transfer pricing documentation required)</w:t>
+        <w:br/>
+        <w:t>• Best when: investor provides genuine, documentable services</w:t>
+        <w:br/>
+        <w:br/>
+        <w:t>Route D — Salary (if investor holds D-8 visa and physically works in Korea):</w:t>
+        <w:br/>
+        <w:t>• Korean salary tax + U.S. income tax (foreign earned income exclusion possible via Form 2555)</w:t>
+        <w:br/>
+        <w:t>• Best when: investor physically resides in Korea and actively manages the business</w:t>
+        <w:br/>
+        <w:br/>
+        <w:t>⚠️ WARNING: ALL repatriation routes require documentation. Korean tax authority (NTS) aggressively audits related-party transactions involving foreign shareholders. Transfer pricing rules apply. Maintain board resolutions, invoices, time logs, and arm's-length pricing analyses.</w:t>
+      </w:r>
+    </w:p>
+    <w:p>
+      <w:pPr>
+        <w:pStyle w:val="Heading1"/>
+      </w:pPr>
+      <w:r>
+        <w:rPr>
+          <w:color w:val="1A3450"/>
+        </w:rPr>
+        <w:t>8. Key Contacts &amp; Resources</w:t>
       </w:r>
     </w:p>
     <w:tbl>
@@ -3185,7 +6349,7 @@
               <w:rPr>
                 <w:sz w:val="18"/>
               </w:rPr>
-              <w:t>Business registration</w:t>
+              <w:t>Business registration + corporate tax</w:t>
             </w:r>
           </w:p>
         </w:tc>
@@ -3384,6 +6548,133 @@
               <w:rPr>
                 <w:sz w:val="18"/>
               </w:rPr>
+              <w:t>Korea Customs Service (관세청)</w:t>
+            </w:r>
+          </w:p>
+        </w:tc>
+        <w:tc>
+          <w:tcPr>
+            <w:tcW w:type="dxa" w:w="3324"/>
+          </w:tcPr>
+          <w:p>
+            <w:r>
+              <w:rPr>
+                <w:sz w:val="18"/>
+              </w:rPr>
+              <w:t>HS Code pre-review + customs exemption</w:t>
+            </w:r>
+          </w:p>
+        </w:tc>
+        <w:tc>
+          <w:tcPr>
+            <w:tcW w:type="dxa" w:w="3324"/>
+          </w:tcPr>
+          <w:p>
+            <w:r>
+              <w:rPr>
+                <w:sz w:val="18"/>
+              </w:rPr>
+              <w:t>customs.go.kr / +82-1577-8577</w:t>
+            </w:r>
+          </w:p>
+        </w:tc>
+      </w:tr>
+      <w:tr>
+        <w:tc>
+          <w:tcPr>
+            <w:tcW w:type="dxa" w:w="3324"/>
+            <w:shd w:fill="f0f4f8" w:val="clear"/>
+          </w:tcPr>
+          <w:p>
+            <w:r>
+              <w:rPr>
+                <w:sz w:val="18"/>
+              </w:rPr>
+              <w:t>National Tax Service (국세청)</w:t>
+            </w:r>
+          </w:p>
+        </w:tc>
+        <w:tc>
+          <w:tcPr>
+            <w:tcW w:type="dxa" w:w="3324"/>
+            <w:shd w:fill="f0f4f8" w:val="clear"/>
+          </w:tcPr>
+          <w:p>
+            <w:r>
+              <w:rPr>
+                <w:sz w:val="18"/>
+              </w:rPr>
+              <w:t>Corporate tax filing, FIPA incentives</w:t>
+            </w:r>
+          </w:p>
+        </w:tc>
+        <w:tc>
+          <w:tcPr>
+            <w:tcW w:type="dxa" w:w="3324"/>
+            <w:shd w:fill="f0f4f8" w:val="clear"/>
+          </w:tcPr>
+          <w:p>
+            <w:r>
+              <w:rPr>
+                <w:sz w:val="18"/>
+              </w:rPr>
+              <w:t>nts.go.kr / +82-126</w:t>
+            </w:r>
+          </w:p>
+        </w:tc>
+      </w:tr>
+      <w:tr>
+        <w:tc>
+          <w:tcPr>
+            <w:tcW w:type="dxa" w:w="3324"/>
+          </w:tcPr>
+          <w:p>
+            <w:r>
+              <w:rPr>
+                <w:sz w:val="18"/>
+              </w:rPr>
+              <w:t>IRS — International Tax</w:t>
+            </w:r>
+          </w:p>
+        </w:tc>
+        <w:tc>
+          <w:tcPr>
+            <w:tcW w:type="dxa" w:w="3324"/>
+          </w:tcPr>
+          <w:p>
+            <w:r>
+              <w:rPr>
+                <w:sz w:val="18"/>
+              </w:rPr>
+              <w:t>Form 5471, FBAR, FATCA questions</w:t>
+            </w:r>
+          </w:p>
+        </w:tc>
+        <w:tc>
+          <w:tcPr>
+            <w:tcW w:type="dxa" w:w="3324"/>
+          </w:tcPr>
+          <w:p>
+            <w:r>
+              <w:rPr>
+                <w:sz w:val="18"/>
+              </w:rPr>
+              <w:t>irs.gov / +1-267-941-1000 (Intl)</w:t>
+            </w:r>
+          </w:p>
+        </w:tc>
+      </w:tr>
+      <w:tr>
+        <w:tc>
+          <w:tcPr>
+            <w:tcW w:type="dxa" w:w="3324"/>
+            <w:shd w:fill="f0f4f8" w:val="clear"/>
+          </w:tcPr>
+          <w:p>
+            <w:r>
+              <w:rPr>
+                <w:sz w:val="18"/>
+              </w:rPr>
               <w:t>Resonate Club Inc. (CEO)</w:t>
             </w:r>
           </w:p>
@@ -3391,6 +6682,7 @@
         <w:tc>
           <w:tcPr>
             <w:tcW w:type="dxa" w:w="3324"/>
+            <w:shd w:fill="f0f4f8" w:val="clear"/>
           </w:tcPr>
           <w:p>
             <w:r>
@@ -3404,13 +6696,14 @@
         <w:tc>
           <w:tcPr>
             <w:tcW w:type="dxa" w:w="3324"/>
-          </w:tcPr>
-          <w:p>
-            <w:r>
-              <w:rPr>
-                <w:sz w:val="18"/>
-              </w:rPr>
-              <w:t>resonatetour.com / heesung2lee@...</w:t>
+            <w:shd w:fill="f0f4f8" w:val="clear"/>
+          </w:tcPr>
+          <w:p>
+            <w:r>
+              <w:rPr>
+                <w:sz w:val="18"/>
+              </w:rPr>
+              <w:t>resonatetour.com</w:t>
             </w:r>
           </w:p>
         </w:tc>
@@ -3422,7 +6715,7 @@
         <w:br/>
         <w:t>---</w:t>
         <w:br/>
-        <w:t>This document is a comprehensive guide based on publicly available information as of June 2026. The investor should consult a Korean-licensed legal professional (법무사/변호사) and a cross-border tax advisor before executing the investment.</w:t>
+        <w:t>This document is a comprehensive guide based on publicly available information as of June 2026. The investor should consult a Korean-licensed legal professional (법무사/변호사), a U.S. cross-border CPA, and a Korean 세무사 before executing the investment. Tax laws, treaty provisions, and FIPA benefit rules are subject to change. Penalties for U.S. international information return non-compliance are severe ($10,000+ per form per year) regardless of whether any tax is ultimately due.</w:t>
       </w:r>
     </w:p>
     <w:sectPr>

</xml_diff>

<commit_message>
CPA audit corrections: F-5 path (300M/2 employees), total investment (130M consistent), D-8 validity (2-3 years), dividend treaty (LLC route), liability insurance added, monthly total updated to 1,727K
</commit_message>
<xml_diff>
--- a/files/Resonate_Club_US_Investor_Guide_EN.docx
+++ b/files/Resonate_Club_US_Investor_Guide_EN.docx
@@ -75,7 +75,7 @@
         <w:t>The investor will own 90% equity (1,800 shares out of 2,000). Hee Sung Lee (F-4 visa holder) will serve as Representative Director (CEO) and own 10% equity (200 shares). The corporation will be registered as a Domestic &amp; International Travel Agency (국내외여행업 / 기획여행사) in Haeundae-gu, Busan, under the Foreign Investment Promotion Act (FIPA).</w:t>
         <w:br/>
         <w:br/>
-        <w:t>The investor's minimum cash requirement is approximately KRW 130 million (~USD $96,300) covering paid-in capital (KRW 100M, well above KRW 50M statutory minimum for 국내외여행업), initial setup costs (KRW 5M), and 1-year operating reserve (KRW 25M).</w:t>
+        <w:t>The investor's minimum cash requirement is approximately KRW 130 million (~USD $86,700) covering paid-in capital (KRW 100M, well above KRW 50M statutory minimum for 국내외여행업), initial setup costs (KRW 5M), and 1-year operating reserve (KRW 25M).</w:t>
         <w:br/>
         <w:br/>
         <w:t>CRITICAL: As a planned travel operator (기획여행사), the corporation must carry KRW 230M in guarantee insurance (KRW 30M base + KRW 200M planned travel addition per Tourism Promotion Act Enforcement Rules Schedule 3). The annual premium is approximately KRW 2.3M (~1% rate) — a cost, not a deposit. This insurance protects customer prepayments in case of business failure and is legally required before registration.</w:t>
@@ -403,7 +403,7 @@
               <w:rPr>
                 <w:sz w:val="18"/>
               </w:rPr>
-              <w:t>KRW 100,000,000 (~USD $74,000)</w:t>
+              <w:t>KRW 100,000,000 (~USD $60,000)</w:t>
             </w:r>
           </w:p>
         </w:tc>
@@ -1060,7 +1060,7 @@
               <w:rPr>
                 <w:sz w:val="18"/>
               </w:rPr>
-              <w:t>5 years per issuance, renewable indefinitely</w:t>
+              <w:t>2–3 years initially, renewable up to 5 years per issuance, renewable indefinitely</w:t>
             </w:r>
           </w:p>
         </w:tc>
@@ -1636,7 +1636,13 @@
               <w:rPr>
                 <w:sz w:val="18"/>
               </w:rPr>
-              <w:t>After 5 years on D-8 + KRW 300M investment OR 2+ Korean employees + income ≥ GNI per capita + clean record</w:t>
+              <w:t>After 5 years on D-8 with continuous residence, no criminal record, and income &gt;= per-capita GNI:</w:t>
+              <w:br/>
+              <w:t xml:space="preserve">  F-5-5 Investor Route: KRW 300M (~$200K) investment OR 2+ full-time Korean employees</w:t>
+              <w:br/>
+              <w:t xml:space="preserve">  F-2-7 Points Route: 80+ points (age, education, Korean proficiency, income, etc.)</w:t>
+              <w:br/>
+              <w:t>Consult immigration attorney for applicable pathway.</w:t>
             </w:r>
           </w:p>
         </w:tc>
@@ -1836,7 +1842,7 @@
               <w:rPr>
                 <w:sz w:val="18"/>
               </w:rPr>
-              <w:t>$74,000</w:t>
+              <w:t>$66,700</w:t>
             </w:r>
           </w:p>
         </w:tc>
@@ -1891,7 +1897,7 @@
               <w:rPr>
                 <w:sz w:val="18"/>
               </w:rPr>
-              <w:t>$66,700</w:t>
+              <w:t>$60,000</w:t>
             </w:r>
           </w:p>
         </w:tc>
@@ -1948,7 +1954,7 @@
               <w:rPr>
                 <w:sz w:val="18"/>
               </w:rPr>
-              <w:t>$7,400</w:t>
+              <w:t>$6,700</w:t>
             </w:r>
           </w:p>
         </w:tc>
@@ -2003,7 +2009,7 @@
               <w:rPr>
                 <w:sz w:val="18"/>
               </w:rPr>
-              <w:t>$3,700</w:t>
+              <w:t>$3,300</w:t>
             </w:r>
           </w:p>
         </w:tc>
@@ -2060,7 +2066,7 @@
               <w:rPr>
                 <w:sz w:val="18"/>
               </w:rPr>
-              <w:t>$18,500</w:t>
+              <w:t>$16,700</w:t>
             </w:r>
           </w:p>
         </w:tc>
@@ -2115,7 +2121,7 @@
               <w:rPr>
                 <w:sz w:val="18"/>
               </w:rPr>
-              <w:t>~$96,300</w:t>
+              <w:t>~$86,700</w:t>
             </w:r>
           </w:p>
         </w:tc>
@@ -2525,8 +2531,70 @@
             <w:tcW w:type="dxa" w:w="2493"/>
           </w:tcPr>
           <w:p>
-            <w:r>
-              <w:rPr>
+            <w:r/>
+            <w:r>
+              <w:rPr>
+                <w:sz w:val="18"/>
+              </w:rPr>
+              <w:t>Liability Insurance</w:t>
+              <w:br/>
+              <w:t>(배상책임보험)</w:t>
+            </w:r>
+          </w:p>
+        </w:tc>
+        <w:tc>
+          <w:tcPr>
+            <w:tcW w:type="dxa" w:w="2493"/>
+          </w:tcPr>
+          <w:p>
+            <w:r/>
+            <w:r>
+              <w:rPr>
+                <w:sz w:val="18"/>
+              </w:rPr>
+              <w:t>35,000</w:t>
+            </w:r>
+          </w:p>
+        </w:tc>
+        <w:tc>
+          <w:tcPr>
+            <w:tcW w:type="dxa" w:w="2493"/>
+          </w:tcPr>
+          <w:p>
+            <w:r/>
+            <w:r>
+              <w:rPr>
+                <w:sz w:val="18"/>
+              </w:rPr>
+              <w:t>420,000</w:t>
+            </w:r>
+          </w:p>
+        </w:tc>
+        <w:tc>
+          <w:tcPr>
+            <w:tcW w:type="dxa" w:w="2493"/>
+          </w:tcPr>
+          <w:p>
+            <w:r/>
+            <w:r>
+              <w:rPr>
+                <w:sz w:val="18"/>
+              </w:rPr>
+              <w:t>Mandatory under Tourism Promotion Act; bodily/property damage coverage during tours</w:t>
+            </w:r>
+          </w:p>
+        </w:tc>
+      </w:tr>
+      <w:tr>
+        <w:tc>
+          <w:tcPr>
+            <w:tcW w:type="dxa" w:w="2493"/>
+          </w:tcPr>
+          <w:p>
+            <w:r/>
+            <w:r>
+              <w:rPr>
+                <w:b/>
                 <w:sz w:val="18"/>
               </w:rPr>
               <w:t>Monthly Total</w:t>
@@ -2538,11 +2606,13 @@
             <w:tcW w:type="dxa" w:w="2493"/>
           </w:tcPr>
           <w:p>
-            <w:r>
-              <w:rPr>
-                <w:sz w:val="18"/>
-              </w:rPr>
-              <w:t>1,692,000</w:t>
+            <w:r/>
+            <w:r>
+              <w:rPr>
+                <w:b/>
+                <w:sz w:val="18"/>
+              </w:rPr>
+              <w:t>1,727,000</w:t>
             </w:r>
           </w:p>
         </w:tc>
@@ -2551,11 +2621,13 @@
             <w:tcW w:type="dxa" w:w="2493"/>
           </w:tcPr>
           <w:p>
-            <w:r>
-              <w:rPr>
-                <w:sz w:val="18"/>
-              </w:rPr>
-              <w:t>20,304,000</w:t>
+            <w:r/>
+            <w:r>
+              <w:rPr>
+                <w:b/>
+                <w:sz w:val="18"/>
+              </w:rPr>
+              <w:t>20,724,000</w:t>
             </w:r>
           </w:p>
         </w:tc>
@@ -2564,8 +2636,10 @@
             <w:tcW w:type="dxa" w:w="2493"/>
           </w:tcPr>
           <w:p>
-            <w:r>
-              <w:rPr>
+            <w:r/>
+            <w:r>
+              <w:rPr>
+                <w:b/>
                 <w:sz w:val="18"/>
               </w:rPr>
             </w:r>
@@ -2601,7 +2675,7 @@
         <w:br/>
         <w:t>Why KRW 230M? The math behind the regulation:</w:t>
         <w:br/>
-        <w:t>• 1 tour group (4 persons × $9,752 × ₩1,350) = ~₩53M in prepayments</w:t>
+        <w:t>• 1 tour group (4 persons × $9,752 × ₩1,500) = ~₩59M in prepayments</w:t>
         <w:br/>
         <w:t>• 3-4 overlapping groups during peak season = ~₩160-210M aggregate exposure</w:t>
         <w:br/>
@@ -2619,7 +2693,7 @@
         <w:br/>
         <w:t>• 영업보증보험 (Guarantee Insurance — mandatory): Covers company FAILURE/BANKRUPTCY only</w:t>
         <w:br/>
-        <w:t>• 배상책임보험 (Liability Insurance — mandatory): Covers company-caused injury/damage during tours</w:t>
+        <w:t>• 배상책임보험 (Liability Insurance (배상책임보험 — mandatory) — mandatory): Covers company-caused injury/damage during tours</w:t>
         <w:br/>
         <w:t>• 여행자보험 (Travel Insurance — optional): Covers individual traveler medical/accident/cancellation</w:t>
         <w:br/>
@@ -2656,12 +2730,12 @@
         <w:br/>
         <w:t>• 12 teams × avg 4 persons × ~$2,500 profit/person ≈ $120,000 gross profit</w:t>
         <w:br/>
-        <w:t>• After operating costs: ~KRW 130M (~$96,000) net operating profit</w:t>
+        <w:t>• After operating costs: ~KRW 130M (~$86,700) net operating profit</w:t>
         <w:br/>
         <w:br/>
         <w:t>Year 2 (full calendar):</w:t>
         <w:br/>
-        <w:t>• 24 teams → ~KRW 312M (~$231,000) net profit</w:t>
+        <w:t>• 24 teams → ~KRW 312M (~$208,000) net profit</w:t>
         <w:br/>
         <w:br/>
         <w:t>Future: USA→Korea inbound luxury tours (requires upgrade to 종합여행업 — additional capital per Tourism Promotion Act)</w:t>
@@ -2683,7 +2757,7 @@
         <w:t>Before proceeding, the investor should confirm:</w:t>
         <w:br/>
         <w:br/>
-        <w:t>1. INVESTMENT AMOUNT: Is the total investment KRW 125M (~$93K) or a higher amount?</w:t>
+        <w:t>1. INVESTMENT AMOUNT: Is the total investment KRW 130M (~$86.7K) or a higher amount?</w:t>
         <w:br/>
         <w:t xml:space="preserve">   (More capital = stronger financials for SGI guarantee insurance approval)</w:t>
         <w:br/>
@@ -2700,7 +2774,7 @@
         <w:br/>
         <w:t>4. PR PATHWAY: Is permanent residency (F-5) a goal?</w:t>
         <w:br/>
-        <w:t xml:space="preserve">   (KRW 300M investment OR hiring 2+ Korean employees opens the F-5-5 route after 5 years)</w:t>
+        <w:t xml:space="preserve">   (The standard D-8-1 F-5 path uses the F-2-7 points system after 5 years. The high-value F-5-5 route requires USD 500,000 investment + 5 Korean employees — verify applicable pathway with an immigration attorney.)</w:t>
         <w:br/>
         <w:br/>
         <w:t>5. TAX STRUCTURE: Consult a cross-border tax advisor for optimal US-Korea structure.</w:t>
@@ -4120,9 +4194,9 @@
               </w:rPr>
               <w:t>Under US-Korea Tax Treaty:</w:t>
               <w:br/>
-              <w:t>15% standard → 10% if 10%+</w:t>
+              <w:t>15% standard (individuals) → 10% if</w:t>
               <w:br/>
-              <w:t>ownership → possibly 5%</w:t>
+              <w:t>held via qualifying corporate entity with ≥10% ownership</w:t>
             </w:r>
           </w:p>
         </w:tc>
@@ -4329,17 +4403,20 @@
             <w:shd w:fill="f0f4f8" w:val="clear"/>
           </w:tcPr>
           <w:p>
-            <w:r>
-              <w:rPr>
-                <w:sz w:val="18"/>
-              </w:rPr>
-              <w:t>15% (standard)</w:t>
+            <w:r/>
+            <w:r>
+              <w:rPr>
+                <w:sz w:val="18"/>
+              </w:rPr>
+              <w:t>15% (standard rate)</w:t>
               <w:br/>
-              <w:t>10% if ≥10% ownership</w:t>
+              <w:t>10% if beneficial owner is a company</w:t>
               <w:br/>
-              <w:t>5% if ≥10% ownership</w:t>
+              <w:t>holding ≥10% voting shares</w:t>
               <w:br/>
-              <w:t>+ certain conditions</w:t>
+              <w:t>(e.g., US LLC taxed as C-Corp)</w:t>
+              <w:br/>
+              <w:t>— No 5% tier under US-Korea treaty</w:t>
             </w:r>
           </w:p>
         </w:tc>
@@ -5191,7 +5268,13 @@
               <w:br/>
               <w:t>(including cash) to foreign</w:t>
               <w:br/>
-              <w:t>corporation</w:t>
+              <w:t>corporation exceeding</w:t>
+              <w:br/>
+              <w:t>$100,000 during the year,</w:t>
+              <w:br/>
+              <w:t>OR if investor holds ≥10%</w:t>
+              <w:br/>
+              <w:t>after transfer (any amount)</w:t>
             </w:r>
           </w:p>
         </w:tc>
@@ -6774,7 +6857,7 @@
         <w:br/>
         <w:t>---</w:t>
         <w:br/>
-        <w:t>This document is a comprehensive guide based on publicly available information as of June 2026. The investor should consult a Korean-licensed legal professional (법무사/변호사), a U.S. cross-border CPA, and a Korean 세무사 before executing the investment. Tax laws, treaty provisions, and FIPA benefit rules are subject to change. Penalties for U.S. international information return non-compliance are severe ($10,000+ per form per year) regardless of whether any tax is ultimately due.</w:t>
+        <w:t>This document is a comprehensive guide based on publicly available information as of June 2026. All USD equivalents are calculated at an exchange rate of KRW 1,500 per USD 1.00 for planning purposes; actual amounts will vary with prevailing rates at the time of transfer. The investor should consult a Korean-licensed legal professional (법무사/변호사), a U.S. cross-border CPA, and a Korean 세무사 before executing the investment. Tax laws, treaty provisions, and FIPA benefit rules are subject to change. Penalties for U.S. international information return non-compliance are severe ($10,000+ per form per year) regardless of whether any tax is ultimately due.</w:t>
       </w:r>
     </w:p>
     <w:sectPr>

</xml_diff>

<commit_message>
Translate all Korean to English throughout document; cleanup doubled parentheticals
</commit_message>
<xml_diff>
--- a/files/Resonate_Club_US_Investor_Guide_EN.docx
+++ b/files/Resonate_Club_US_Investor_Guide_EN.docx
@@ -16,7 +16,7 @@
         </w:rPr>
         <w:t>RESONATE CLUB INC.</w:t>
         <w:br/>
-        <w:t>(리조네이트 클럽 주식회사)</w:t>
+        <w:t>(Resonate Club Inc.)</w:t>
       </w:r>
     </w:p>
     <w:p>
@@ -69,16 +69,16 @@
     </w:p>
     <w:p>
       <w:r>
-        <w:t>This document outlines everything a U.S. investor needs to know and do to establish Resonate Club Inc. (리조네이트 클럽 주식회사), a premium Korea↔USA travel corporation, by the target date of August 1, 2026.</w:t>
+        <w:t>This document outlines everything a U.S. investor needs to know and do to establish Resonate Club Inc., a premium Korea↔USA travel corporation, by the target date of August 1, 2026.</w:t>
         <w:br/>
         <w:br/>
-        <w:t>The investor will own 90% equity (1,800 shares out of 2,000). Hee Sung Lee (F-4 visa holder) will serve as Representative Director (CEO) and own 10% equity (200 shares). The corporation will be registered as a Domestic &amp; International Travel Agency (국내외여행업 / 기획여행사) in Haeundae-gu, Busan, under the Foreign Investment Promotion Act (FIPA).</w:t>
+        <w:t>The investor will own 90% equity (1,800 shares out of 2,000). Hee Sung Lee (F-4 visa holder) will serve as Representative Director (CEO) and own 10% equity (200 shares). The corporation will be registered as a Domestic &amp; International Travel Agency (Domestic &amp; International Travel Agency / Planned Travel Operator) in Haeundae-gu, Busan, under the Foreign Investment Promotion Act (FIPA).</w:t>
         <w:br/>
         <w:br/>
-        <w:t>The investor's minimum cash requirement is approximately KRW 130 million (~USD $86,700) covering paid-in capital (KRW 100M, well above KRW 50M statutory minimum for 국내외여행업), initial setup costs (KRW 5M), and 1-year operating reserve (KRW 25M).</w:t>
+        <w:t>The investor's minimum cash requirement is approximately KRW 130 million (~USD $86,700) covering paid-in capital (KRW 100M, well above KRW 50M statutory minimum for Domestic &amp; International Travel Agency), initial setup costs (KRW 5M), and 1-year operating reserve (KRW 25M).</w:t>
         <w:br/>
         <w:br/>
-        <w:t>CRITICAL: As a planned travel operator (기획여행사), the corporation must carry KRW 230M in guarantee insurance (KRW 30M base + KRW 200M planned travel addition per Tourism Promotion Act Enforcement Rules Schedule 3). The annual premium is approximately KRW 2.3M (~1% rate) — a cost, not a deposit. This insurance protects customer prepayments in case of business failure and is legally required before registration.</w:t>
+        <w:t>CRITICAL: As a planned travel operator (Planned Travel Operator), the corporation must carry KRW 230M in guarantee insurance (KRW 30M base + KRW 200M planned travel addition per Tourism Promotion Act Enforcement Rules Schedule 3). The annual premium is approximately KRW 2.3M (~1% rate) — a cost, not a deposit. This insurance protects customer prepayments in case of business failure and is legally required before registration.</w:t>
         <w:br/>
         <w:br/>
         <w:t>The investor qualifies for a D-8-1 Corporate Investment Visa with full residency rights, family accompaniment, tax incentives, and a pathway to permanent residency (F-5).</w:t>
@@ -171,7 +171,7 @@
               <w:rPr>
                 <w:sz w:val="18"/>
               </w:rPr>
-              <w:t>Resonate Club Inc. (리조네이트 클럽 주식회사) — Joint-Stock Company (주식회사)</w:t>
+              <w:t>Resonate Club Inc. — Joint-Stock Company</w:t>
             </w:r>
           </w:p>
         </w:tc>
@@ -199,7 +199,7 @@
               <w:rPr>
                 <w:sz w:val="18"/>
               </w:rPr>
-              <w:t>Resonate Tour (결 투어)</w:t>
+              <w:t>Resonate Tour</w:t>
             </w:r>
           </w:p>
         </w:tc>
@@ -257,7 +257,7 @@
               <w:rPr>
                 <w:sz w:val="18"/>
               </w:rPr>
-              <w:t>Domestic &amp; International Travel Agency (국내외여행업) — Planned Travel (기획여행사)</w:t>
+              <w:t>Domestic &amp; International Travel Agency — Planned Travel (Planned Travel Operator)</w:t>
             </w:r>
           </w:p>
         </w:tc>
@@ -373,7 +373,7 @@
               <w:rPr>
                 <w:sz w:val="18"/>
               </w:rPr>
-              <w:t>200 shares / KRW 10,000,000 — Representative Director (대표이사)</w:t>
+              <w:t>200 shares / KRW 10,000,000 — Representative Director</w:t>
             </w:r>
           </w:p>
         </w:tc>
@@ -671,7 +671,7 @@
               <w:rPr>
                 <w:sz w:val="18"/>
               </w:rPr>
-              <w:t>• File Foreign Investment Notification (외국인투자신고) at KOTRA or foreign exchange bank</w:t>
+              <w:t>• File Foreign Investment Notification at KOTRA or foreign exchange bank</w:t>
               <w:br/>
               <w:t>• Transfer investment funds to escrow/capital account</w:t>
               <w:br/>
@@ -730,11 +730,11 @@
               <w:rPr>
                 <w:sz w:val="18"/>
               </w:rPr>
-              <w:t>• Court registration (부산지방법원 동부지원)</w:t>
+              <w:t>• Court registration (Busan District Court, Eastern Branch)</w:t>
               <w:br/>
               <w:t>• Corporate seal certificate issuance</w:t>
               <w:br/>
-              <w:t>• Business registration (해운대세무서)</w:t>
+              <w:t>• Business registration (Haeundae Tax Office)</w:t>
               <w:br/>
               <w:t>• Open corporate bank account</w:t>
             </w:r>
@@ -793,9 +793,9 @@
               <w:rPr>
                 <w:sz w:val="18"/>
               </w:rPr>
-              <w:t>• Submit travel agency application (해운대구청)</w:t>
+              <w:t>• Submit travel agency application (Haeundae-gu Office)</w:t>
               <w:br/>
-              <w:t>• Secure guarantee insurance (SGI 서울보증보험)</w:t>
+              <w:t>• Secure guarantee insurance (SGI Seoul Guarantee Insurance (SGI))</w:t>
               <w:br/>
               <w:t>• Complete registration — legally operational!</w:t>
             </w:r>
@@ -1032,7 +1032,7 @@
               <w:rPr>
                 <w:sz w:val="18"/>
               </w:rPr>
-              <w:t>KRW 100,000,000 minimum (D-8 visa threshold) — your KRW 90M investment qualifies with 10%+ share ownership. Note: travel agency statutory minimum capital is KRW 50M (국내외여행업) — investor-backed total far exceeds this.</w:t>
+              <w:t>KRW 100,000,000 minimum (D-8 visa threshold) — your KRW 90M investment qualifies with 10%+ share ownership. Note: travel agency statutory minimum capital is KRW 50M (Domestic &amp; International Travel Agency) — investor-backed total far exceeds this.</w:t>
             </w:r>
           </w:p>
         </w:tc>
@@ -1114,21 +1114,21 @@
         <w:br/>
         <w:t>• Passport (valid 6+ months) + photo (3.5×4.5cm)</w:t>
         <w:br/>
-        <w:t>• FDI Registration Certificate (외국인투자기업등록증명서)</w:t>
+        <w:t>• FDI Registration Certificate (FDI Enterprise Registration Certificate)</w:t>
         <w:br/>
-        <w:t>• Corporate registry extract (법인등기부등본)</w:t>
+        <w:t>• Corporate registry extract (Corporate Registry Extract)</w:t>
         <w:br/>
-        <w:t>• Business registration certificate (사업자등록증)</w:t>
+        <w:t>• Business registration certificate (Business Registration Certificate)</w:t>
         <w:br/>
-        <w:t>• Shareholder registry (주주명부)</w:t>
+        <w:t>• Shareholder registry (Shareholder Registry)</w:t>
         <w:br/>
-        <w:t>• Articles of incorporation (정관)</w:t>
+        <w:t>• Articles of incorporation (Articles of Incorporation)</w:t>
         <w:br/>
-        <w:t>• Bank certificate proving fund transfer (입금증명서)</w:t>
+        <w:t>• Bank certificate proving fund transfer (Bank Deposit Certificate)</w:t>
         <w:br/>
         <w:t>• Business plan (English accepted)</w:t>
         <w:br/>
-        <w:t>• Office lease agreement (실제 사무실 필수)</w:t>
+        <w:t>• Office lease agreement (Physical office mandatory)</w:t>
         <w:br/>
         <w:t>• Criminal background check — apostilled (FBI background check + US Dept. of State apostille)</w:t>
         <w:br/>
@@ -1856,7 +1856,7 @@
               <w:rPr>
                 <w:sz w:val="18"/>
               </w:rPr>
-              <w:t>Statutory minimum for 국내외여행업 KRW 50M; actual KRW 100M with investor (exceeds minimum)</w:t>
+              <w:t>Statutory minimum for Domestic &amp; International Travel Agency KRW 50M; actual KRW 100M with investor (exceeds minimum)</w:t>
             </w:r>
           </w:p>
         </w:tc>
@@ -2537,8 +2537,6 @@
                 <w:sz w:val="18"/>
               </w:rPr>
               <w:t>Liability Insurance</w:t>
-              <w:br/>
-              <w:t>(배상책임보험)</w:t>
             </w:r>
           </w:p>
         </w:tc>
@@ -2664,13 +2662,13 @@
         <w:t>Why 230M KRW insurance when the capital is only 100M KRW?</w:t>
         <w:br/>
         <w:br/>
-        <w:t>The guarantee insurance (영업보증보험) and paid-in capital serve COMPLETELY DIFFERENT functions under Korean law. Understanding this distinction is critical:</w:t>
+        <w:t>The guarantee insurance (Business Guarantee Insurance) and paid-in capital serve COMPLETELY DIFFERENT functions under Korean law. Understanding this distinction is critical:</w:t>
         <w:br/>
         <w:br/>
-        <w:t>PAID-IN CAPITAL (자본금): Proves the company has minimum operational solvency. This money is spent on rent, salaries, marketing, and operations — it provides NO protection to customers.</w:t>
+        <w:t>PAID-IN CAPITAL (Paid-in Capital): Proves the company has minimum operational solvency. This money is spent on rent, salaries, marketing, and operations — it provides NO protection to customers.</w:t>
         <w:br/>
         <w:br/>
-        <w:t>GUARANTEE INSURANCE (영업보증보험): Protects customer PREPAYMENTS. As a planned travel operator (기획여행사), Resonate Club collects full payment from customers months before travel. These prepayments fund flights, hotels, and golf bookings. If the company fails mid-season, customers could lose everything. The insurance bond guarantees customer refunds up to KRW 230M.</w:t>
+        <w:t>GUARANTEE INSURANCE (Business Guarantee Insurance): Protects customer PREPAYMENTS. As a planned travel operator (Planned Travel Operator), Resonate Club collects full payment from customers months before travel. These prepayments fund flights, hotels, and golf bookings. If the company fails mid-season, customers could lose everything. The insurance bond guarantees customer refunds up to KRW 230M.</w:t>
         <w:br/>
         <w:br/>
         <w:t>Why KRW 230M? The math behind the regulation:</w:t>
@@ -2686,19 +2684,19 @@
         <w:t>• TOTAL 230M ≈ maximum plausible simultaneous customer exposure for a small agency</w:t>
         <w:br/>
         <w:br/>
-        <w:t>IS IT PROPORTIONAL? The Korean travel industry has long argued that the planned travel surcharge (200M) is excessive for small agencies. However, the Tourism Promotion Act Enforcement Rules Schedule 3 makes no exceptions — 기획여행 requires BOTH the base insurance AND the additional planned travel bonding. This is non-negotiable for registration.</w:t>
+        <w:t>IS IT PROPORTIONAL? The Korean travel industry has long argued that the planned travel surcharge (200M) is excessive for small agencies. However, the Tourism Promotion Act Enforcement Rules Schedule 3 makes no exceptions — Planned Travel requires BOTH the base insurance AND the additional planned travel bonding. This is non-negotiable for registration.</w:t>
         <w:br/>
         <w:br/>
         <w:t>Three types of insurance — do not confuse them:</w:t>
         <w:br/>
-        <w:t>• 영업보증보험 (Guarantee Insurance — mandatory): Covers company FAILURE/BANKRUPTCY only</w:t>
+        <w:t>• Business Guarantee Insurance (Guarantee Insurance — mandatory): Covers company FAILURE/BANKRUPTCY only</w:t>
         <w:br/>
-        <w:t>• 배상책임보험 (Liability Insurance (배상책임보험 — mandatory) — mandatory): Covers company-caused injury/damage during tours</w:t>
+        <w:t>• Liability Insurance (Liability Insurance (Liability Insurance — mandatory) — mandatory): Covers company-caused injury/damage during tours</w:t>
         <w:br/>
-        <w:t>• 여행자보험 (Travel Insurance — optional): Covers individual traveler medical/accident/cancellation</w:t>
+        <w:t>• Traveler's Insurance (Travel Insurance — optional): Covers individual traveler medical/accident/cancellation</w:t>
         <w:br/>
         <w:br/>
-        <w:t>ALTERNATIVE STRATEGY: If the 230M bond proves difficult to obtain from SGI, the company can initially register WITHOUT the planned travel designation (국내외여행업 only, broker model), operating on a pure booking/commission basis for 6-12 months. After building revenue history, upgrade to planned travel status. This lowers the initial bond to 30M but restricts the company from creating and selling its own package products directly.</w:t>
+        <w:t>ALTERNATIVE STRATEGY: If the 230M bond proves difficult to obtain from SGI, the company can initially register WITHOUT the planned travel designation (Domestic &amp; International Travel Agency only, broker model), operating on a pure booking/commission basis for 6-12 months. After building revenue history, upgrade to planned travel status. This lowers the initial bond to 30M but restricts the company from creating and selling its own package products directly.</w:t>
       </w:r>
     </w:p>
     <w:p>
@@ -2738,7 +2736,7 @@
         <w:t>• 24 teams → ~KRW 312M (~$208,000) net profit</w:t>
         <w:br/>
         <w:br/>
-        <w:t>Future: USA→Korea inbound luxury tours (requires upgrade to 종합여행업 — additional capital per Tourism Promotion Act)</w:t>
+        <w:t>Future: USA→Korea inbound luxury tours (requires upgrade to Comprehensive Travel Agency — additional capital per Tourism Promotion Act)</w:t>
       </w:r>
     </w:p>
     <w:p>
@@ -2949,7 +2947,7 @@
               <w:rPr>
                 <w:sz w:val="18"/>
               </w:rPr>
-              <w:t>Strong business plan + 신용보증기금 route as backup</w:t>
+              <w:t>Strong business plan + Korea Credit Guarantee Fund route as backup</w:t>
             </w:r>
           </w:p>
         </w:tc>
@@ -3224,7 +3222,7 @@
     </w:p>
     <w:p>
       <w:r>
-        <w:t>This section outlines EVERY tax-related action the investor needs to take — in both the United States and Korea — organized chronologically from pre-investment through ongoing annual compliance. Engaging a qualified cross-border CPA (U.S. side) and a Korean 세무사 (tax accountant) is NOT optional — penalties for non-compliance are severe on both sides.</w:t>
+        <w:t>This section outlines EVERY tax-related action the investor needs to take — in both the United States and Korea — organized chronologically from pre-investment through ongoing annual compliance. Engaging a qualified cross-border CPA (U.S. side) and a Korean Certified Tax Accountant (CTA) (tax accountant) is NOT optional — penalties for non-compliance are severe on both sides.</w:t>
       </w:r>
     </w:p>
     <w:p>
@@ -3435,7 +3433,7 @@
               <w:rPr>
                 <w:sz w:val="18"/>
               </w:rPr>
-              <w:t>Korean 세무사</w:t>
+              <w:t>Korean Certified Tax Accountant (CTA)</w:t>
               <w:br/>
               <w:t>(Tax Accountant)</w:t>
             </w:r>
@@ -3463,7 +3461,7 @@
               <w:rPr>
                 <w:sz w:val="18"/>
               </w:rPr>
-              <w:t>Jul–Aug 2026 (before 사업자등록)</w:t>
+              <w:t>Jul–Aug 2026 (before Business Registration)</w:t>
             </w:r>
           </w:p>
         </w:tc>
@@ -3580,9 +3578,7 @@
               <w:rPr>
                 <w:sz w:val="18"/>
               </w:rPr>
-              <w:t>Korean 법무사</w:t>
-              <w:br/>
-              <w:t>(Legal Administrator)</w:t>
+              <w:t>Korean Certified Legal Administrator</w:t>
             </w:r>
           </w:p>
         </w:tc>
@@ -3723,7 +3719,7 @@
     </w:p>
     <w:p>
       <w:r>
-        <w:t>Under the Foreign Investment Promotion Act (FIPA / 외국인투자촉진법), foreign-invested enterprises qualify for the following tax benefits. Each requires proactive APPLICATION — they are not automatic.</w:t>
+        <w:t>Under the Foreign Investment Promotion Act (FIPA / Foreign Investment Promotion Act (FIPA)), foreign-invested enterprises qualify for the following tax benefits. Each requires proactive APPLICATION — they are not automatic.</w:t>
       </w:r>
     </w:p>
     <w:tbl>
@@ -3850,7 +3846,7 @@
               </w:rPr>
               <w:t>Corporate Income Tax</w:t>
               <w:br/>
-              <w:t>Reduction (법인세 감면)</w:t>
+              <w:t>Reduction (Corporate Tax Reduction)</w:t>
             </w:r>
           </w:p>
         </w:tc>
@@ -3912,7 +3908,7 @@
               <w:rPr>
                 <w:sz w:val="18"/>
               </w:rPr>
-              <w:t>Korean 세무사 — files with NTS</w:t>
+              <w:t>Korean Certified Tax Accountant (CTA) — files with NTS</w:t>
               <w:br/>
               <w:t>(FIPA Article 121-2, RETI Article 116-2)</w:t>
             </w:r>
@@ -3931,7 +3927,7 @@
               </w:rPr>
               <w:t>Acquisition Tax</w:t>
               <w:br/>
-              <w:t>Exemption (취득세 면제)</w:t>
+              <w:t>Exemption (Acquisition Tax Exemption)</w:t>
             </w:r>
           </w:p>
         </w:tc>
@@ -3991,9 +3987,9 @@
               <w:rPr>
                 <w:sz w:val="18"/>
               </w:rPr>
-              <w:t>Korean 세무사 — files with local</w:t>
+              <w:t>Korean Certified Tax Accountant (CTA) — files with local</w:t>
               <w:br/>
-              <w:t>government (지방자치단체)</w:t>
+              <w:t>government (Local Government)</w:t>
               <w:br/>
               <w:t>(FIPA Article 121-3)</w:t>
             </w:r>
@@ -4013,7 +4009,7 @@
               </w:rPr>
               <w:t>Property Tax</w:t>
               <w:br/>
-              <w:t>Reduction (재산세 감면)</w:t>
+              <w:t>Reduction (Property Tax Reduction)</w:t>
             </w:r>
           </w:p>
         </w:tc>
@@ -4075,7 +4071,7 @@
               <w:rPr>
                 <w:sz w:val="18"/>
               </w:rPr>
-              <w:t>Korean 세무사</w:t>
+              <w:t>Korean Certified Tax Accountant (CTA)</w:t>
             </w:r>
           </w:p>
         </w:tc>
@@ -4091,8 +4087,6 @@
                 <w:sz w:val="18"/>
               </w:rPr>
               <w:t>Customs Duty Exemption</w:t>
-              <w:br/>
-              <w:t>(관세 면제)</w:t>
             </w:r>
           </w:p>
         </w:tc>
@@ -4143,7 +4137,7 @@
               <w:br/>
               <w:t>with Korea Customs</w:t>
               <w:br/>
-              <w:t>Service (관세청)</w:t>
+              <w:t>Service (Korea Customs Service (KCS))</w:t>
             </w:r>
           </w:p>
         </w:tc>
@@ -4156,11 +4150,11 @@
               <w:rPr>
                 <w:sz w:val="18"/>
               </w:rPr>
-              <w:t>Korean 세무사/관세사</w:t>
+              <w:t>Korean Tax Accountant / Customs Broker</w:t>
               <w:br/>
               <w:t>Pre-approval: HS Code</w:t>
               <w:br/>
-              <w:t>사전심사 recommended</w:t>
+              <w:t>HS Code Pre-Review recommended</w:t>
             </w:r>
           </w:p>
         </w:tc>
@@ -4238,7 +4232,7 @@
               <w:rPr>
                 <w:sz w:val="18"/>
               </w:rPr>
-              <w:t>Korean 세무사 — reduced</w:t>
+              <w:t>Korean Certified Tax Accountant (CTA) — reduced</w:t>
               <w:br/>
               <w:t>rate application + U.S. Form</w:t>
               <w:br/>
@@ -4255,13 +4249,13 @@
       <w:r>
         <w:t>⚠️ CRITICAL for FIPA Benefits:</w:t>
         <w:br/>
-        <w:t>• Must file 외국인투자기업 등록신청 (FDI Enterprise Registration) BEFORE any tax benefit application</w:t>
+        <w:t>• Must file FDI Enterprise Registration Application (FDI Enterprise Registration) BEFORE any tax benefit application</w:t>
         <w:br/>
-        <w:t>• Tax reduction application (조세감면신청서) must be filed within the first taxable year after earning profit</w:t>
+        <w:t>• Tax reduction application (Tax Reduction Application) must be filed within the first taxable year after earning profit</w:t>
         <w:br/>
         <w:t>• MISSING the application deadline = permanent loss of the benefit for that year (no retroactive remedy)</w:t>
         <w:br/>
-        <w:t>• The 세무사 must reference FIPA Article 121-2 through 121-5 and Restriction of Special Taxation Act (조세특례제한법)</w:t>
+        <w:t>• The Certified Tax Accountant (CTA) must reference FIPA Article 121-2 through 121-5 and Restriction of Special Taxation Act</w:t>
         <w:br/>
         <w:t>• Local tax exemptions require separate application to Busan Metropolitan City / Haeundae-gu office</w:t>
       </w:r>
@@ -4379,7 +4373,7 @@
               <w:rPr>
                 <w:sz w:val="18"/>
               </w:rPr>
-              <w:t>Dividends (배당소득)</w:t>
+              <w:t>Dividends (Dividend Income)</w:t>
             </w:r>
           </w:p>
         </w:tc>
@@ -4449,7 +4443,7 @@
               <w:rPr>
                 <w:sz w:val="18"/>
               </w:rPr>
-              <w:t>Interest (이자소득)</w:t>
+              <w:t>Interest (Interest Income)</w:t>
             </w:r>
           </w:p>
         </w:tc>
@@ -4508,7 +4502,7 @@
               <w:rPr>
                 <w:sz w:val="18"/>
               </w:rPr>
-              <w:t>Royalties (사용료)</w:t>
+              <w:t>Royalties</w:t>
             </w:r>
           </w:p>
         </w:tc>
@@ -4567,7 +4561,7 @@
               <w:rPr>
                 <w:sz w:val="18"/>
               </w:rPr>
-              <w:t>Capital Gains (양도소득)</w:t>
+              <w:t>Capital Gains</w:t>
             </w:r>
           </w:p>
         </w:tc>
@@ -5669,7 +5663,7 @@
               <w:br/>
               <w:t>⑪ Open corporate bank account</w:t>
               <w:br/>
-              <w:t>⑫ Engage Korean 세무사</w:t>
+              <w:t>⑫ Engage Korean Certified Tax Accountant (CTA)</w:t>
             </w:r>
           </w:p>
         </w:tc>
@@ -5682,7 +5676,7 @@
               <w:rPr>
                 <w:sz w:val="18"/>
               </w:rPr>
-              <w:t>CEO + 법무사</w:t>
+              <w:t>CEO + Certified Legal Administrator</w:t>
             </w:r>
           </w:p>
         </w:tc>
@@ -5695,9 +5689,9 @@
               <w:rPr>
                 <w:sz w:val="18"/>
               </w:rPr>
-              <w:t>법인등기부등본;</w:t>
+              <w:t>Corporate Registry Extract;</w:t>
               <w:br/>
-              <w:t>세무사 engagement letter</w:t>
+              <w:t>Certified Tax Accountant (CTA) engagement letter</w:t>
             </w:r>
           </w:p>
         </w:tc>
@@ -5729,11 +5723,11 @@
               <w:rPr>
                 <w:sz w:val="18"/>
               </w:rPr>
-              <w:t>⑬ Register for business (사업자등록)</w:t>
+              <w:t>⑬ Register for business (Business Registration)</w:t>
               <w:br/>
               <w:t>⑭ Register for VAT</w:t>
               <w:br/>
-              <w:t>⑮ Apply for corporate tax ID (법인세 납세번호)</w:t>
+              <w:t>⑮ Apply for corporate tax ID (Corporate Taxpayer ID)</w:t>
             </w:r>
           </w:p>
         </w:tc>
@@ -5747,7 +5741,7 @@
               <w:rPr>
                 <w:sz w:val="18"/>
               </w:rPr>
-              <w:t>CEO + 세무사</w:t>
+              <w:t>CEO + Certified Tax Accountant (CTA)</w:t>
             </w:r>
           </w:p>
         </w:tc>
@@ -5761,7 +5755,7 @@
               <w:rPr>
                 <w:sz w:val="18"/>
               </w:rPr>
-              <w:t>사업자등록증;</w:t>
+              <w:t>Business Registration Certificate;</w:t>
               <w:br/>
               <w:t>NTS taxpayer number</w:t>
             </w:r>
@@ -5793,9 +5787,9 @@
               </w:rPr>
               <w:t>⑯ Apply for FIPA corporate tax reduction</w:t>
               <w:br/>
-              <w:t>⑰ Apply for local tax exemptions (취득세/재산세)</w:t>
+              <w:t>⑰ Apply for local tax exemptions (Acquisition/Property Tax)</w:t>
               <w:br/>
-              <w:t>⑱ File FIPA incentive application (조세감면신청서)</w:t>
+              <w:t>⑱ File FIPA incentive application (Tax Reduction Application)</w:t>
             </w:r>
           </w:p>
         </w:tc>
@@ -5808,7 +5802,7 @@
               <w:rPr>
                 <w:sz w:val="18"/>
               </w:rPr>
-              <w:t>세무사</w:t>
+              <w:t>Certified Tax Accountant (CTA)</w:t>
             </w:r>
           </w:p>
         </w:tc>
@@ -5859,7 +5853,7 @@
               </w:rPr>
               <w:t>⑲ For each qualifying capital goods import:</w:t>
               <w:br/>
-              <w:t xml:space="preserve">  - Pre-file HS Code 사전심사 with 관세청</w:t>
+              <w:t xml:space="preserve">  - Pre-file HS Code HS Code Pre-Review with Korea Customs Service (KCS)</w:t>
               <w:br/>
               <w:t xml:space="preserve">  - Apply for customs duty exemption</w:t>
               <w:br/>
@@ -5877,7 +5871,7 @@
               <w:rPr>
                 <w:sz w:val="18"/>
               </w:rPr>
-              <w:t>세무사 + 관세사</w:t>
+              <w:t>Certified Tax Accountant (CTA) + Customs Broker</w:t>
             </w:r>
           </w:p>
         </w:tc>
@@ -5923,11 +5917,11 @@
               <w:rPr>
                 <w:sz w:val="18"/>
               </w:rPr>
-              <w:t>⑳ File first corporate tax return (법인세 신고)</w:t>
+              <w:t>⑳ File first corporate tax return (Corporate Tax Return Filing)</w:t>
               <w:br/>
               <w:t>㉑ Claim FIPA tax reduction on first profit</w:t>
               <w:br/>
-              <w:t>㉒ File VAT returns (부가세 신고 — quarterly)</w:t>
+              <w:t>㉒ File VAT returns (VAT Return Filing — quarterly)</w:t>
             </w:r>
           </w:p>
         </w:tc>
@@ -5940,7 +5934,7 @@
               <w:rPr>
                 <w:sz w:val="18"/>
               </w:rPr>
-              <w:t>세무사</w:t>
+              <w:t>Certified Tax Accountant (CTA)</w:t>
             </w:r>
           </w:p>
         </w:tc>
@@ -6084,7 +6078,7 @@
               <w:rPr>
                 <w:sz w:val="18"/>
               </w:rPr>
-              <w:t>CPA + 세무사</w:t>
+              <w:t>CPA + Certified Tax Accountant (CTA)</w:t>
               <w:br/>
               <w:t>+ Investor</w:t>
             </w:r>
@@ -6135,7 +6129,7 @@
               </w:rPr>
               <w:t>㉝ Korean withholding tax at treaty rate (10-15%)</w:t>
               <w:br/>
-              <w:t>㉞ Korean 세무사 files reduced rate application</w:t>
+              <w:t>㉞ Korean Certified Tax Accountant (CTA) files reduced rate application</w:t>
               <w:br/>
               <w:t>㉟ U.S. CPA claims foreign tax credit (Form 1116)</w:t>
             </w:r>
@@ -6151,7 +6145,7 @@
               <w:rPr>
                 <w:sz w:val="18"/>
               </w:rPr>
-              <w:t>세무사 + CPA</w:t>
+              <w:t>Certified Tax Accountant (CTA) + CPA</w:t>
             </w:r>
           </w:p>
         </w:tc>
@@ -6218,7 +6212,7 @@
               <w:rPr>
                 <w:sz w:val="18"/>
               </w:rPr>
-              <w:t>CPA + 세무사</w:t>
+              <w:t>CPA + Certified Tax Accountant (CTA)</w:t>
               <w:br/>
               <w:t>+ Investor</w:t>
             </w:r>
@@ -6258,7 +6252,7 @@
         <w:t>How the investor eventually takes money out of Korea matters significantly for tax.</w:t>
         <w:br/>
         <w:br/>
-        <w:t>Route A — Dividend Distribution (배당):</w:t>
+        <w:t>Route A — Dividend Distribution (Dividend):</w:t>
         <w:br/>
         <w:t>• Korean corp declares dividend → 10–15% Korean withholding tax → investor receives net</w:t>
         <w:br/>
@@ -6690,7 +6684,7 @@
               <w:rPr>
                 <w:sz w:val="18"/>
               </w:rPr>
-              <w:t>Korea Customs Service (관세청)</w:t>
+              <w:t>Korea Customs Service (Korea Customs Service (KCS))</w:t>
             </w:r>
           </w:p>
         </w:tc>
@@ -6732,7 +6726,7 @@
               <w:rPr>
                 <w:sz w:val="18"/>
               </w:rPr>
-              <w:t>National Tax Service (국세청)</w:t>
+              <w:t>National Tax Service (National Tax Service (NTS))</w:t>
             </w:r>
           </w:p>
         </w:tc>
@@ -6857,7 +6851,7 @@
         <w:br/>
         <w:t>---</w:t>
         <w:br/>
-        <w:t>This document is a comprehensive guide based on publicly available information as of June 2026. All USD equivalents are calculated at an exchange rate of KRW 1,500 per USD 1.00 for planning purposes; actual amounts will vary with prevailing rates at the time of transfer. The investor should consult a Korean-licensed legal professional (법무사/변호사), a U.S. cross-border CPA, and a Korean 세무사 before executing the investment. Tax laws, treaty provisions, and FIPA benefit rules are subject to change. Penalties for U.S. international information return non-compliance are severe ($10,000+ per form per year) regardless of whether any tax is ultimately due.</w:t>
+        <w:t>This document is a comprehensive guide based on publicly available information as of June 2026. All USD equivalents are calculated at an exchange rate of KRW 1,500 per USD 1.00 for planning purposes; actual amounts will vary with prevailing rates at the time of transfer. The investor should consult a Korean-licensed legal professional (Certified Legal Administrator/Attorney), a U.S. cross-border CPA, and a Korean Certified Tax Accountant (CTA) before executing the investment. Tax laws, treaty provisions, and FIPA benefit rules are subject to change. Penalties for U.S. international information return non-compliance are severe ($10,000+ per form per year) regardless of whether any tax is ultimately due.</w:t>
       </w:r>
     </w:p>
     <w:sectPr>

</xml_diff>